<commit_message>
Refresh CI and Kubernetes screenshots and report for MLOPS-Assignment
</commit_message>
<xml_diff>
--- a/report/MLOps_Assignment1_Report.docx
+++ b/report/MLOps_Assignment1_Report.docx
@@ -333,7 +333,7 @@
                 <w:sz w:val="18"/>
                 <w:szCs w:val="18"/>
               </w:rPr>
-              <w:t xml:space="preserve">https://github.com/Akshaya-Panda/Assignment-MLOPS</w:t>
+              <w:t xml:space="preserve">https://github.com/Akshaya-Panda/MLOPS-Assignment</w:t>
             </w:r>
           </w:p>
         </w:tc>
@@ -387,7 +387,7 @@
                 <w:sz w:val="18"/>
                 <w:szCs w:val="18"/>
               </w:rPr>
-              <w:t xml:space="preserve">ghcr.io/akshaya-panda/assignment-mlops:latest</w:t>
+              <w:t xml:space="preserve">ghcr.io/akshaya-panda/mlops-assignment:latest</w:t>
             </w:r>
           </w:p>
         </w:tc>
@@ -1347,7 +1347,7 @@
           <w:sz w:val="19"/>
           <w:szCs w:val="19"/>
         </w:rPr>
-        <w:t xml:space="preserve">git clone https://github.com/Akshaya-Panda/Assignment-MLOPS.git</w:t>
+        <w:t xml:space="preserve">git clone https://github.com/Akshaya-Panda/MLOPS-Assignment.git</w:t>
       </w:r>
       <w:r>
         <w:t xml:space="preserve">, </w:t>
@@ -1618,7 +1618,7 @@
           <w:sz w:val="19"/>
           <w:szCs w:val="19"/>
         </w:rPr>
-        <w:t xml:space="preserve">docker run -p 8000:8000 ghcr.io/akshaya-panda/assignment-mlops:latest</w:t>
+        <w:t xml:space="preserve">docker run -p 8000:8000 ghcr.io/akshaya-panda/mlops-assignment:latest</w:t>
       </w:r>
       <w:r>
         <w:t xml:space="preserve">.</w:t>
@@ -4491,7 +4491,7 @@
       <w:r>
         <w:drawing>
           <wp:inline distT="0" distB="0" distL="0" distR="0">
-            <wp:extent cx="5715000" cy="2457450"/>
+            <wp:extent cx="5715000" cy="2600325"/>
             <wp:effectExtent t="0" r="0" b="0" l="0"/>
             <wp:docPr id="14" name="k8s_01_cluster_and_workloads.png" descr="Cluster, Deployment (2/2 ready), pods, PodDisruptionBudget and services, including the LoadBalancer." title="Cluster, Deployment (2/2 ready), pods, PodDisruptionBudget and services, including the LoadBalancer."/>
             <wp:cNvGraphicFramePr>
@@ -4516,7 +4516,7 @@
                   <pic:spPr bwMode="auto">
                     <a:xfrm>
                       <a:off x="0" y="0"/>
-                      <a:ext cx="5715000" cy="2457450"/>
+                      <a:ext cx="5715000" cy="2600325"/>
                     </a:xfrm>
                     <a:prstGeom prst="rect">
                       <a:avLst/>
@@ -4564,7 +4564,7 @@
       <w:r>
         <w:drawing>
           <wp:inline distT="0" distB="0" distL="0" distR="0">
-            <wp:extent cx="5715000" cy="2524125"/>
+            <wp:extent cx="5715000" cy="2009775"/>
             <wp:effectExtent t="0" r="0" b="0" l="0"/>
             <wp:docPr id="15" name="k8s_03_loadbalancer_requests.png" descr="Endpoint verification through the LoadBalancer, including a rejected invalid request and pod logs." title="Endpoint verification through the LoadBalancer, including a rejected invalid request and pod logs."/>
             <wp:cNvGraphicFramePr>
@@ -4589,7 +4589,7 @@
                   <pic:spPr bwMode="auto">
                     <a:xfrm>
                       <a:off x="0" y="0"/>
-                      <a:ext cx="5715000" cy="2524125"/>
+                      <a:ext cx="5715000" cy="2009775"/>
                     </a:xfrm>
                     <a:prstGeom prst="rect">
                       <a:avLst/>
@@ -4922,12 +4922,12 @@
         </w:rPr>
         <w:t xml:space="preserve">Repository: </w:t>
       </w:r>
-      <w:hyperlink w:history="1" r:id="rIdyb88unajred7uqmgtcxwf">
+      <w:hyperlink w:history="1" r:id="rIdfoce5g_7n3ulrmpr07pek">
         <w:r>
           <w:rPr>
             <w:rStyle w:val="Hyperlink"/>
           </w:rPr>
-          <w:t xml:space="preserve">https://github.com/Akshaya-Panda/Assignment-MLOPS</w:t>
+          <w:t xml:space="preserve">https://github.com/Akshaya-Panda/MLOPS-Assignment</w:t>
         </w:r>
       </w:hyperlink>
     </w:p>
@@ -4942,12 +4942,12 @@
         </w:rPr>
         <w:t xml:space="preserve">CI/CD runs: </w:t>
       </w:r>
-      <w:hyperlink w:history="1" r:id="rIdpmm_dkqj_92q81pnvgpep">
+      <w:hyperlink w:history="1" r:id="rIdjowj4uhzs0tycxjlnanb1">
         <w:r>
           <w:rPr>
             <w:rStyle w:val="Hyperlink"/>
           </w:rPr>
-          <w:t xml:space="preserve">https://github.com/Akshaya-Panda/Assignment-MLOPS/actions</w:t>
+          <w:t xml:space="preserve">https://github.com/Akshaya-Panda/MLOPS-Assignment/actions</w:t>
         </w:r>
       </w:hyperlink>
     </w:p>
@@ -4963,7 +4963,7 @@
         <w:t xml:space="preserve">Container image: </w:t>
       </w:r>
       <w:r>
-        <w:t xml:space="preserve">ghcr.io/akshaya-panda/assignment-mlops (tags: commit SHA, latest)</w:t>
+        <w:t xml:space="preserve">ghcr.io/akshaya-panda/mlops-assignment (tags: commit SHA, latest)</w:t>
       </w:r>
     </w:p>
     <w:tbl>

</xml_diff>

<commit_message>
Add pipeline video link to README and report
</commit_message>
<xml_diff>
--- a/report/MLOps_Assignment1_Report.docx
+++ b/report/MLOps_Assignment1_Report.docx
@@ -388,6 +388,60 @@
                 <w:szCs w:val="18"/>
               </w:rPr>
               <w:t xml:space="preserve">ghcr.io/akshaya-panda/mlops-assignment:latest</w:t>
+            </w:r>
+          </w:p>
+        </w:tc>
+      </w:tr>
+      <w:tr>
+        <w:tc>
+          <w:tcPr>
+            <w:tcW w:type="dxa" w:w="2300"/>
+            <w:tcBorders>
+              <w:top w:val="single" w:color="BFC7CC" w:sz="4"/>
+              <w:left w:val="single" w:color="BFC7CC" w:sz="4"/>
+              <w:bottom w:val="single" w:color="BFC7CC" w:sz="4"/>
+              <w:right w:val="single" w:color="BFC7CC" w:sz="4"/>
+            </w:tcBorders>
+            <w:tcMar>
+              <w:top w:type="dxa" w:w="50"/>
+              <w:left w:type="dxa" w:w="90"/>
+              <w:bottom w:type="dxa" w:w="50"/>
+              <w:right w:type="dxa" w:w="90"/>
+            </w:tcMar>
+          </w:tcPr>
+          <w:p>
+            <w:r>
+              <w:rPr>
+                <w:sz w:val="18"/>
+                <w:szCs w:val="18"/>
+              </w:rPr>
+              <w:t xml:space="preserve">Pipeline video</w:t>
+            </w:r>
+          </w:p>
+        </w:tc>
+        <w:tc>
+          <w:tcPr>
+            <w:tcW w:type="dxa" w:w="6726"/>
+            <w:tcBorders>
+              <w:top w:val="single" w:color="BFC7CC" w:sz="4"/>
+              <w:left w:val="single" w:color="BFC7CC" w:sz="4"/>
+              <w:bottom w:val="single" w:color="BFC7CC" w:sz="4"/>
+              <w:right w:val="single" w:color="BFC7CC" w:sz="4"/>
+            </w:tcBorders>
+            <w:tcMar>
+              <w:top w:type="dxa" w:w="50"/>
+              <w:left w:type="dxa" w:w="90"/>
+              <w:bottom w:type="dxa" w:w="50"/>
+              <w:right w:type="dxa" w:w="90"/>
+            </w:tcMar>
+          </w:tcPr>
+          <w:p>
+            <w:r>
+              <w:rPr>
+                <w:sz w:val="18"/>
+                <w:szCs w:val="18"/>
+              </w:rPr>
+              <w:t xml:space="preserve">https://drive.google.com/file/d/1v9RSQ5GZHEdgctoHnKYSgbIbN-CkWtpa/view?usp=sharing</w:t>
             </w:r>
           </w:p>
         </w:tc>
@@ -1237,7 +1291,7 @@
                     </pic:cNvPicPr>
                   </pic:nvPicPr>
                   <pic:blipFill>
-                    <a:blip r:embed="rId10" cstate="none"/>
+                    <a:blip r:embed="rId11" cstate="none"/>
                     <a:srcRect/>
                     <a:stretch>
                       <a:fillRect/>
@@ -1742,62 +1796,6 @@
                   <wp:extent cx="2743200" cy="1876425"/>
                   <wp:effectExtent t="0" r="0" b="0" l="0"/>
                   <wp:docPr id="2" name="eda_class_balance.png" descr="Class balance (164 negative, 139 positive) and missing values per feature." title="Class balance (164 negative, 139 positive) and missing values per feature."/>
-                  <wp:cNvGraphicFramePr>
-                    <a:graphicFrameLocks xmlns:a="http://schemas.openxmlformats.org/drawingml/2006/main" noChangeAspect="1"/>
-                  </wp:cNvGraphicFramePr>
-                  <a:graphic xmlns:a="http://schemas.openxmlformats.org/drawingml/2006/main">
-                    <a:graphicData uri="http://schemas.openxmlformats.org/drawingml/2006/picture">
-                      <pic:pic xmlns:pic="http://schemas.openxmlformats.org/drawingml/2006/picture">
-                        <pic:nvPicPr>
-                          <pic:cNvPr id="0" name="" descr=""/>
-                          <pic:cNvPicPr>
-                            <a:picLocks noChangeAspect="1" noChangeArrowheads="1"/>
-                          </pic:cNvPicPr>
-                        </pic:nvPicPr>
-                        <pic:blipFill>
-                          <a:blip r:embed="rId11" cstate="none"/>
-                          <a:srcRect/>
-                          <a:stretch>
-                            <a:fillRect/>
-                          </a:stretch>
-                        </pic:blipFill>
-                        <pic:spPr bwMode="auto">
-                          <a:xfrm>
-                            <a:off x="0" y="0"/>
-                            <a:ext cx="2743200" cy="1876425"/>
-                          </a:xfrm>
-                          <a:prstGeom prst="rect">
-                            <a:avLst/>
-                          </a:prstGeom>
-                        </pic:spPr>
-                      </pic:pic>
-                    </a:graphicData>
-                  </a:graphic>
-                </wp:inline>
-              </w:drawing>
-            </w:r>
-          </w:p>
-        </w:tc>
-        <w:tc>
-          <w:tcPr>
-            <w:tcW w:type="dxa" w:w="4513"/>
-            <w:tcBorders>
-              <w:top w:val="none" w:color="FFFFFF" w:sz="0"/>
-              <w:left w:val="none" w:color="FFFFFF" w:sz="0"/>
-              <w:bottom w:val="none" w:color="FFFFFF" w:sz="0"/>
-              <w:right w:val="none" w:color="FFFFFF" w:sz="0"/>
-            </w:tcBorders>
-          </w:tcPr>
-          <w:p>
-            <w:pPr>
-              <w:jc w:val="center"/>
-            </w:pPr>
-            <w:r>
-              <w:drawing>
-                <wp:inline distT="0" distB="0" distL="0" distR="0">
-                  <wp:extent cx="2743200" cy="1895475"/>
-                  <wp:effectExtent t="0" r="0" b="0" l="0"/>
-                  <wp:docPr id="3" name="eda_missing_values.png" descr="Class balance (164 negative, 139 positive) and missing values per feature." title="Class balance (164 negative, 139 positive) and missing values per feature."/>
                   <wp:cNvGraphicFramePr>
                     <a:graphicFrameLocks xmlns:a="http://schemas.openxmlformats.org/drawingml/2006/main" noChangeAspect="1"/>
                   </wp:cNvGraphicFramePr>
@@ -1820,6 +1818,62 @@
                         <pic:spPr bwMode="auto">
                           <a:xfrm>
                             <a:off x="0" y="0"/>
+                            <a:ext cx="2743200" cy="1876425"/>
+                          </a:xfrm>
+                          <a:prstGeom prst="rect">
+                            <a:avLst/>
+                          </a:prstGeom>
+                        </pic:spPr>
+                      </pic:pic>
+                    </a:graphicData>
+                  </a:graphic>
+                </wp:inline>
+              </w:drawing>
+            </w:r>
+          </w:p>
+        </w:tc>
+        <w:tc>
+          <w:tcPr>
+            <w:tcW w:type="dxa" w:w="4513"/>
+            <w:tcBorders>
+              <w:top w:val="none" w:color="FFFFFF" w:sz="0"/>
+              <w:left w:val="none" w:color="FFFFFF" w:sz="0"/>
+              <w:bottom w:val="none" w:color="FFFFFF" w:sz="0"/>
+              <w:right w:val="none" w:color="FFFFFF" w:sz="0"/>
+            </w:tcBorders>
+          </w:tcPr>
+          <w:p>
+            <w:pPr>
+              <w:jc w:val="center"/>
+            </w:pPr>
+            <w:r>
+              <w:drawing>
+                <wp:inline distT="0" distB="0" distL="0" distR="0">
+                  <wp:extent cx="2743200" cy="1895475"/>
+                  <wp:effectExtent t="0" r="0" b="0" l="0"/>
+                  <wp:docPr id="3" name="eda_missing_values.png" descr="Class balance (164 negative, 139 positive) and missing values per feature." title="Class balance (164 negative, 139 positive) and missing values per feature."/>
+                  <wp:cNvGraphicFramePr>
+                    <a:graphicFrameLocks xmlns:a="http://schemas.openxmlformats.org/drawingml/2006/main" noChangeAspect="1"/>
+                  </wp:cNvGraphicFramePr>
+                  <a:graphic xmlns:a="http://schemas.openxmlformats.org/drawingml/2006/main">
+                    <a:graphicData uri="http://schemas.openxmlformats.org/drawingml/2006/picture">
+                      <pic:pic xmlns:pic="http://schemas.openxmlformats.org/drawingml/2006/picture">
+                        <pic:nvPicPr>
+                          <pic:cNvPr id="0" name="" descr=""/>
+                          <pic:cNvPicPr>
+                            <a:picLocks noChangeAspect="1" noChangeArrowheads="1"/>
+                          </pic:cNvPicPr>
+                        </pic:nvPicPr>
+                        <pic:blipFill>
+                          <a:blip r:embed="rId13" cstate="none"/>
+                          <a:srcRect/>
+                          <a:stretch>
+                            <a:fillRect/>
+                          </a:stretch>
+                        </pic:blipFill>
+                        <pic:spPr bwMode="auto">
+                          <a:xfrm>
+                            <a:off x="0" y="0"/>
                             <a:ext cx="2743200" cy="1895475"/>
                           </a:xfrm>
                           <a:prstGeom prst="rect">
@@ -1874,79 +1928,6 @@
             <wp:extent cx="5715000" cy="3057525"/>
             <wp:effectExtent t="0" r="0" b="0" l="0"/>
             <wp:docPr id="4" name="eda_numeric_distributions.png" descr="Continuous features by diagnosis. The engineered ratio thalach / (220 - age) separates the classes." title="Continuous features by diagnosis. The engineered ratio thalach / (220 - age) separates the classes."/>
-            <wp:cNvGraphicFramePr>
-              <a:graphicFrameLocks xmlns:a="http://schemas.openxmlformats.org/drawingml/2006/main" noChangeAspect="1"/>
-            </wp:cNvGraphicFramePr>
-            <a:graphic xmlns:a="http://schemas.openxmlformats.org/drawingml/2006/main">
-              <a:graphicData uri="http://schemas.openxmlformats.org/drawingml/2006/picture">
-                <pic:pic xmlns:pic="http://schemas.openxmlformats.org/drawingml/2006/picture">
-                  <pic:nvPicPr>
-                    <pic:cNvPr id="0" name="" descr=""/>
-                    <pic:cNvPicPr>
-                      <a:picLocks noChangeAspect="1" noChangeArrowheads="1"/>
-                    </pic:cNvPicPr>
-                  </pic:nvPicPr>
-                  <pic:blipFill>
-                    <a:blip r:embed="rId13" cstate="none"/>
-                    <a:srcRect/>
-                    <a:stretch>
-                      <a:fillRect/>
-                    </a:stretch>
-                  </pic:blipFill>
-                  <pic:spPr bwMode="auto">
-                    <a:xfrm>
-                      <a:off x="0" y="0"/>
-                      <a:ext cx="5715000" cy="3057525"/>
-                    </a:xfrm>
-                    <a:prstGeom prst="rect">
-                      <a:avLst/>
-                    </a:prstGeom>
-                  </pic:spPr>
-                </pic:pic>
-              </a:graphicData>
-            </a:graphic>
-          </wp:inline>
-        </w:drawing>
-      </w:r>
-    </w:p>
-    <w:p>
-      <w:pPr>
-        <w:spacing w:after="200"/>
-        <w:jc w:val="center"/>
-      </w:pPr>
-      <w:r>
-        <w:rPr>
-          <w:b/>
-          <w:bCs/>
-          <w:color w:val="555555"/>
-          <w:sz w:val="18"/>
-          <w:szCs w:val="18"/>
-        </w:rPr>
-        <w:t xml:space="preserve">Figure 3. </w:t>
-      </w:r>
-      <w:r>
-        <w:rPr>
-          <w:i/>
-          <w:iCs/>
-          <w:color w:val="555555"/>
-          <w:sz w:val="18"/>
-          <w:szCs w:val="18"/>
-        </w:rPr>
-        <w:t xml:space="preserve">Continuous features by diagnosis. The engineered ratio thalach / (220 - age) separates the classes.</w:t>
-      </w:r>
-    </w:p>
-    <w:p>
-      <w:pPr>
-        <w:keepNext/>
-        <w:spacing w:after="40" w:before="120"/>
-        <w:jc w:val="center"/>
-      </w:pPr>
-      <w:r>
-        <w:drawing>
-          <wp:inline distT="0" distB="0" distL="0" distR="0">
-            <wp:extent cx="5715000" cy="2647950"/>
-            <wp:effectExtent t="0" r="0" b="0" l="0"/>
-            <wp:docPr id="5" name="eda_categorical_risk.png" descr="Disease rate per category (dashed line: overall rate 46 %)." title="Disease rate per category (dashed line: overall rate 46 %)."/>
             <wp:cNvGraphicFramePr>
               <a:graphicFrameLocks xmlns:a="http://schemas.openxmlformats.org/drawingml/2006/main" noChangeAspect="1"/>
             </wp:cNvGraphicFramePr>
@@ -1969,7 +1950,7 @@
                   <pic:spPr bwMode="auto">
                     <a:xfrm>
                       <a:off x="0" y="0"/>
-                      <a:ext cx="5715000" cy="2647950"/>
+                      <a:ext cx="5715000" cy="3057525"/>
                     </a:xfrm>
                     <a:prstGeom prst="rect">
                       <a:avLst/>
@@ -1995,7 +1976,7 @@
           <w:sz w:val="18"/>
           <w:szCs w:val="18"/>
         </w:rPr>
-        <w:t xml:space="preserve">Figure 4. </w:t>
+        <w:t xml:space="preserve">Figure 3. </w:t>
       </w:r>
       <w:r>
         <w:rPr>
@@ -2005,948 +1986,7 @@
           <w:sz w:val="18"/>
           <w:szCs w:val="18"/>
         </w:rPr>
-        <w:t xml:space="preserve">Disease rate per category (dashed line: overall rate 46 %).</w:t>
-      </w:r>
-    </w:p>
-    <w:p>
-      <w:pPr>
-        <w:spacing w:after="120" w:line="276"/>
-      </w:pPr>
-      <w:r>
-        <w:t xml:space="preserve">Key findings:</w:t>
-      </w:r>
-    </w:p>
-    <w:p>
-      <w:pPr>
-        <w:pStyle w:val="ListParagraph"/>
-        <w:numPr>
-          <w:ilvl w:val="0"/>
-          <w:numId w:val="3"/>
-        </w:numPr>
-        <w:spacing w:after="60"/>
-      </w:pPr>
-      <w:r>
-        <w:t xml:space="preserve">Stress-test and imaging features dominate: </w:t>
-      </w:r>
-      <w:r>
-        <w:rPr>
-          <w:rFonts w:ascii="Consolas" w:cs="Consolas" w:eastAsia="Consolas" w:hAnsi="Consolas"/>
-          <w:sz w:val="19"/>
-          <w:szCs w:val="19"/>
-        </w:rPr>
-        <w:t xml:space="preserve">thal</w:t>
-      </w:r>
-      <w:r>
-        <w:t xml:space="preserve"> (Spearman 0.52), </w:t>
-      </w:r>
-      <w:r>
-        <w:rPr>
-          <w:rFonts w:ascii="Consolas" w:cs="Consolas" w:eastAsia="Consolas" w:hAnsi="Consolas"/>
-          <w:sz w:val="19"/>
-          <w:szCs w:val="19"/>
-        </w:rPr>
-        <w:t xml:space="preserve">ca</w:t>
-      </w:r>
-      <w:r>
-        <w:t xml:space="preserve"> (0.49), </w:t>
-      </w:r>
-      <w:r>
-        <w:rPr>
-          <w:rFonts w:ascii="Consolas" w:cs="Consolas" w:eastAsia="Consolas" w:hAnsi="Consolas"/>
-          <w:sz w:val="19"/>
-          <w:szCs w:val="19"/>
-        </w:rPr>
-        <w:t xml:space="preserve">cp</w:t>
-      </w:r>
-      <w:r>
-        <w:t xml:space="preserve"> (0.47), </w:t>
-      </w:r>
-      <w:r>
-        <w:rPr>
-          <w:rFonts w:ascii="Consolas" w:cs="Consolas" w:eastAsia="Consolas" w:hAnsi="Consolas"/>
-          <w:sz w:val="19"/>
-          <w:szCs w:val="19"/>
-        </w:rPr>
-        <w:t xml:space="preserve">exang</w:t>
-      </w:r>
-      <w:r>
-        <w:t xml:space="preserve"> (0.43), </w:t>
-      </w:r>
-      <w:r>
-        <w:rPr>
-          <w:rFonts w:ascii="Consolas" w:cs="Consolas" w:eastAsia="Consolas" w:hAnsi="Consolas"/>
-          <w:sz w:val="19"/>
-          <w:szCs w:val="19"/>
-        </w:rPr>
-        <w:t xml:space="preserve">oldpeak</w:t>
-      </w:r>
-      <w:r>
-        <w:t xml:space="preserve"> (0.41) and </w:t>
-      </w:r>
-      <w:r>
-        <w:rPr>
-          <w:rFonts w:ascii="Consolas" w:cs="Consolas" w:eastAsia="Consolas" w:hAnsi="Consolas"/>
-          <w:sz w:val="19"/>
-          <w:szCs w:val="19"/>
-        </w:rPr>
-        <w:t xml:space="preserve">thalach</w:t>
-      </w:r>
-      <w:r>
-        <w:t xml:space="preserve"> (-0.42). Fasting blood sugar is uninformative (0.03).</w:t>
-      </w:r>
-    </w:p>
-    <w:p>
-      <w:pPr>
-        <w:pStyle w:val="ListParagraph"/>
-        <w:numPr>
-          <w:ilvl w:val="0"/>
-          <w:numId w:val="3"/>
-        </w:numPr>
-        <w:spacing w:after="60"/>
-      </w:pPr>
-      <w:r>
-        <w:t xml:space="preserve">Asymptomatic chest pain carries a 73 % disease rate, against 18 to 30 % for the other types; one or more vessels on fluoroscopy raises it to 68 to 85 %.</w:t>
-      </w:r>
-    </w:p>
-    <w:p>
-      <w:pPr>
-        <w:pStyle w:val="ListParagraph"/>
-        <w:numPr>
-          <w:ilvl w:val="0"/>
-          <w:numId w:val="3"/>
-        </w:numPr>
-        <w:spacing w:after="60"/>
-      </w:pPr>
-      <w:r>
-        <w:t xml:space="preserve">Diseased patients are older and reach a lower maximum heart rate. Because maximum heart rate falls with age, the age-normalised ratio was engineered as a feature.</w:t>
-      </w:r>
-    </w:p>
-    <w:p>
-      <w:pPr>
-        <w:pStyle w:val="ListParagraph"/>
-        <w:numPr>
-          <w:ilvl w:val="0"/>
-          <w:numId w:val="3"/>
-        </w:numPr>
-        <w:spacing w:after="60"/>
-      </w:pPr>
-      <w:r>
-        <w:t xml:space="preserve">No feature pair exceeds |rho| = 0.6, so all 13 features are kept and regularisation is left to tuning.</w:t>
-      </w:r>
-    </w:p>
-    <w:p>
-      <w:pPr>
-        <w:pStyle w:val="Heading1"/>
-      </w:pPr>
-      <w:r>
-        <w:t xml:space="preserve">5. Feature engineering and model development</w:t>
-      </w:r>
-    </w:p>
-    <w:tbl>
-      <w:tblPr>
-        <w:tblW w:type="dxa" w:w="9026"/>
-        <w:tblBorders>
-          <w:top w:val="single" w:color="auto" w:sz="4"/>
-          <w:left w:val="single" w:color="auto" w:sz="4"/>
-          <w:bottom w:val="single" w:color="auto" w:sz="4"/>
-          <w:right w:val="single" w:color="auto" w:sz="4"/>
-          <w:insideH w:val="single" w:color="auto" w:sz="4"/>
-          <w:insideV w:val="single" w:color="auto" w:sz="4"/>
-        </w:tblBorders>
-      </w:tblPr>
-      <w:tblGrid>
-        <w:gridCol w:w="1400"/>
-        <w:gridCol w:w="4126"/>
-        <w:gridCol w:w="3500"/>
-      </w:tblGrid>
-      <w:tr>
-        <w:trPr>
-          <w:tblHeader/>
-        </w:trPr>
-        <w:tc>
-          <w:tcPr>
-            <w:tcW w:type="dxa" w:w="1400"/>
-            <w:tcBorders>
-              <w:top w:val="single" w:color="BFC7CC" w:sz="4"/>
-              <w:left w:val="single" w:color="BFC7CC" w:sz="4"/>
-              <w:bottom w:val="single" w:color="BFC7CC" w:sz="4"/>
-              <w:right w:val="single" w:color="BFC7CC" w:sz="4"/>
-            </w:tcBorders>
-            <w:shd w:fill="DCE8EC" w:color="auto" w:val="clear"/>
-            <w:tcMar>
-              <w:top w:type="dxa" w:w="50"/>
-              <w:left w:type="dxa" w:w="90"/>
-              <w:bottom w:type="dxa" w:w="50"/>
-              <w:right w:type="dxa" w:w="90"/>
-            </w:tcMar>
-          </w:tcPr>
-          <w:p>
-            <w:r>
-              <w:rPr>
-                <w:b/>
-                <w:bCs/>
-                <w:sz w:val="18"/>
-                <w:szCs w:val="18"/>
-              </w:rPr>
-              <w:t xml:space="preserve">Group</w:t>
-            </w:r>
-          </w:p>
-        </w:tc>
-        <w:tc>
-          <w:tcPr>
-            <w:tcW w:type="dxa" w:w="4126"/>
-            <w:tcBorders>
-              <w:top w:val="single" w:color="BFC7CC" w:sz="4"/>
-              <w:left w:val="single" w:color="BFC7CC" w:sz="4"/>
-              <w:bottom w:val="single" w:color="BFC7CC" w:sz="4"/>
-              <w:right w:val="single" w:color="BFC7CC" w:sz="4"/>
-            </w:tcBorders>
-            <w:shd w:fill="DCE8EC" w:color="auto" w:val="clear"/>
-            <w:tcMar>
-              <w:top w:type="dxa" w:w="50"/>
-              <w:left w:type="dxa" w:w="90"/>
-              <w:bottom w:type="dxa" w:w="50"/>
-              <w:right w:type="dxa" w:w="90"/>
-            </w:tcMar>
-          </w:tcPr>
-          <w:p>
-            <w:r>
-              <w:rPr>
-                <w:b/>
-                <w:bCs/>
-                <w:sz w:val="18"/>
-                <w:szCs w:val="18"/>
-              </w:rPr>
-              <w:t xml:space="preserve">Columns</w:t>
-            </w:r>
-          </w:p>
-        </w:tc>
-        <w:tc>
-          <w:tcPr>
-            <w:tcW w:type="dxa" w:w="3500"/>
-            <w:tcBorders>
-              <w:top w:val="single" w:color="BFC7CC" w:sz="4"/>
-              <w:left w:val="single" w:color="BFC7CC" w:sz="4"/>
-              <w:bottom w:val="single" w:color="BFC7CC" w:sz="4"/>
-              <w:right w:val="single" w:color="BFC7CC" w:sz="4"/>
-            </w:tcBorders>
-            <w:shd w:fill="DCE8EC" w:color="auto" w:val="clear"/>
-            <w:tcMar>
-              <w:top w:type="dxa" w:w="50"/>
-              <w:left w:type="dxa" w:w="90"/>
-              <w:bottom w:type="dxa" w:w="50"/>
-              <w:right w:type="dxa" w:w="90"/>
-            </w:tcMar>
-          </w:tcPr>
-          <w:p>
-            <w:r>
-              <w:rPr>
-                <w:b/>
-                <w:bCs/>
-                <w:sz w:val="18"/>
-                <w:szCs w:val="18"/>
-              </w:rPr>
-              <w:t xml:space="preserve">Transformation</w:t>
-            </w:r>
-          </w:p>
-        </w:tc>
-      </w:tr>
-      <w:tr>
-        <w:tc>
-          <w:tcPr>
-            <w:tcW w:type="dxa" w:w="1400"/>
-            <w:tcBorders>
-              <w:top w:val="single" w:color="BFC7CC" w:sz="4"/>
-              <w:left w:val="single" w:color="BFC7CC" w:sz="4"/>
-              <w:bottom w:val="single" w:color="BFC7CC" w:sz="4"/>
-              <w:right w:val="single" w:color="BFC7CC" w:sz="4"/>
-            </w:tcBorders>
-            <w:tcMar>
-              <w:top w:type="dxa" w:w="50"/>
-              <w:left w:type="dxa" w:w="90"/>
-              <w:bottom w:type="dxa" w:w="50"/>
-              <w:right w:type="dxa" w:w="90"/>
-            </w:tcMar>
-          </w:tcPr>
-          <w:p>
-            <w:r>
-              <w:rPr>
-                <w:sz w:val="18"/>
-                <w:szCs w:val="18"/>
-              </w:rPr>
-              <w:t xml:space="preserve">Numeric</w:t>
-            </w:r>
-          </w:p>
-        </w:tc>
-        <w:tc>
-          <w:tcPr>
-            <w:tcW w:type="dxa" w:w="4126"/>
-            <w:tcBorders>
-              <w:top w:val="single" w:color="BFC7CC" w:sz="4"/>
-              <w:left w:val="single" w:color="BFC7CC" w:sz="4"/>
-              <w:bottom w:val="single" w:color="BFC7CC" w:sz="4"/>
-              <w:right w:val="single" w:color="BFC7CC" w:sz="4"/>
-            </w:tcBorders>
-            <w:tcMar>
-              <w:top w:type="dxa" w:w="50"/>
-              <w:left w:type="dxa" w:w="90"/>
-              <w:bottom w:type="dxa" w:w="50"/>
-              <w:right w:type="dxa" w:w="90"/>
-            </w:tcMar>
-          </w:tcPr>
-          <w:p>
-            <w:r>
-              <w:rPr>
-                <w:sz w:val="18"/>
-                <w:szCs w:val="18"/>
-              </w:rPr>
-              <w:t xml:space="preserve">age, trestbps, chol, thalach, oldpeak, ca</w:t>
-            </w:r>
-          </w:p>
-        </w:tc>
-        <w:tc>
-          <w:tcPr>
-            <w:tcW w:type="dxa" w:w="3500"/>
-            <w:tcBorders>
-              <w:top w:val="single" w:color="BFC7CC" w:sz="4"/>
-              <w:left w:val="single" w:color="BFC7CC" w:sz="4"/>
-              <w:bottom w:val="single" w:color="BFC7CC" w:sz="4"/>
-              <w:right w:val="single" w:color="BFC7CC" w:sz="4"/>
-            </w:tcBorders>
-            <w:tcMar>
-              <w:top w:type="dxa" w:w="50"/>
-              <w:left w:type="dxa" w:w="90"/>
-              <w:bottom w:type="dxa" w:w="50"/>
-              <w:right w:type="dxa" w:w="90"/>
-            </w:tcMar>
-          </w:tcPr>
-          <w:p>
-            <w:r>
-              <w:rPr>
-                <w:sz w:val="18"/>
-                <w:szCs w:val="18"/>
-              </w:rPr>
-              <w:t xml:space="preserve">median imputation, standard scaling</w:t>
-            </w:r>
-          </w:p>
-        </w:tc>
-      </w:tr>
-      <w:tr>
-        <w:tc>
-          <w:tcPr>
-            <w:tcW w:type="dxa" w:w="1400"/>
-            <w:tcBorders>
-              <w:top w:val="single" w:color="BFC7CC" w:sz="4"/>
-              <w:left w:val="single" w:color="BFC7CC" w:sz="4"/>
-              <w:bottom w:val="single" w:color="BFC7CC" w:sz="4"/>
-              <w:right w:val="single" w:color="BFC7CC" w:sz="4"/>
-            </w:tcBorders>
-            <w:tcMar>
-              <w:top w:type="dxa" w:w="50"/>
-              <w:left w:type="dxa" w:w="90"/>
-              <w:bottom w:type="dxa" w:w="50"/>
-              <w:right w:type="dxa" w:w="90"/>
-            </w:tcMar>
-          </w:tcPr>
-          <w:p>
-            <w:r>
-              <w:rPr>
-                <w:sz w:val="18"/>
-                <w:szCs w:val="18"/>
-              </w:rPr>
-              <w:t xml:space="preserve">Engineered</w:t>
-            </w:r>
-          </w:p>
-        </w:tc>
-        <w:tc>
-          <w:tcPr>
-            <w:tcW w:type="dxa" w:w="4126"/>
-            <w:tcBorders>
-              <w:top w:val="single" w:color="BFC7CC" w:sz="4"/>
-              <w:left w:val="single" w:color="BFC7CC" w:sz="4"/>
-              <w:bottom w:val="single" w:color="BFC7CC" w:sz="4"/>
-              <w:right w:val="single" w:color="BFC7CC" w:sz="4"/>
-            </w:tcBorders>
-            <w:tcMar>
-              <w:top w:type="dxa" w:w="50"/>
-              <w:left w:type="dxa" w:w="90"/>
-              <w:bottom w:type="dxa" w:w="50"/>
-              <w:right w:type="dxa" w:w="90"/>
-            </w:tcMar>
-          </w:tcPr>
-          <w:p>
-            <w:r>
-              <w:rPr>
-                <w:sz w:val="18"/>
-                <w:szCs w:val="18"/>
-              </w:rPr>
-              <w:t xml:space="preserve">pct_max_hr = thalach / (220 - age); bp_stage (ACC/AHA 2017, 0 to 3)</w:t>
-            </w:r>
-          </w:p>
-        </w:tc>
-        <w:tc>
-          <w:tcPr>
-            <w:tcW w:type="dxa" w:w="3500"/>
-            <w:tcBorders>
-              <w:top w:val="single" w:color="BFC7CC" w:sz="4"/>
-              <w:left w:val="single" w:color="BFC7CC" w:sz="4"/>
-              <w:bottom w:val="single" w:color="BFC7CC" w:sz="4"/>
-              <w:right w:val="single" w:color="BFC7CC" w:sz="4"/>
-            </w:tcBorders>
-            <w:tcMar>
-              <w:top w:type="dxa" w:w="50"/>
-              <w:left w:type="dxa" w:w="90"/>
-              <w:bottom w:type="dxa" w:w="50"/>
-              <w:right w:type="dxa" w:w="90"/>
-            </w:tcMar>
-          </w:tcPr>
-          <w:p>
-            <w:r>
-              <w:rPr>
-                <w:sz w:val="18"/>
-                <w:szCs w:val="18"/>
-              </w:rPr>
-              <w:t xml:space="preserve">custom ClinicalFeatureAdder, then as numeric</w:t>
-            </w:r>
-          </w:p>
-        </w:tc>
-      </w:tr>
-      <w:tr>
-        <w:tc>
-          <w:tcPr>
-            <w:tcW w:type="dxa" w:w="1400"/>
-            <w:tcBorders>
-              <w:top w:val="single" w:color="BFC7CC" w:sz="4"/>
-              <w:left w:val="single" w:color="BFC7CC" w:sz="4"/>
-              <w:bottom w:val="single" w:color="BFC7CC" w:sz="4"/>
-              <w:right w:val="single" w:color="BFC7CC" w:sz="4"/>
-            </w:tcBorders>
-            <w:tcMar>
-              <w:top w:type="dxa" w:w="50"/>
-              <w:left w:type="dxa" w:w="90"/>
-              <w:bottom w:type="dxa" w:w="50"/>
-              <w:right w:type="dxa" w:w="90"/>
-            </w:tcMar>
-          </w:tcPr>
-          <w:p>
-            <w:r>
-              <w:rPr>
-                <w:sz w:val="18"/>
-                <w:szCs w:val="18"/>
-              </w:rPr>
-              <w:t xml:space="preserve">Binary</w:t>
-            </w:r>
-          </w:p>
-        </w:tc>
-        <w:tc>
-          <w:tcPr>
-            <w:tcW w:type="dxa" w:w="4126"/>
-            <w:tcBorders>
-              <w:top w:val="single" w:color="BFC7CC" w:sz="4"/>
-              <w:left w:val="single" w:color="BFC7CC" w:sz="4"/>
-              <w:bottom w:val="single" w:color="BFC7CC" w:sz="4"/>
-              <w:right w:val="single" w:color="BFC7CC" w:sz="4"/>
-            </w:tcBorders>
-            <w:tcMar>
-              <w:top w:type="dxa" w:w="50"/>
-              <w:left w:type="dxa" w:w="90"/>
-              <w:bottom w:type="dxa" w:w="50"/>
-              <w:right w:type="dxa" w:w="90"/>
-            </w:tcMar>
-          </w:tcPr>
-          <w:p>
-            <w:r>
-              <w:rPr>
-                <w:sz w:val="18"/>
-                <w:szCs w:val="18"/>
-              </w:rPr>
-              <w:t xml:space="preserve">sex, fbs, exang</w:t>
-            </w:r>
-          </w:p>
-        </w:tc>
-        <w:tc>
-          <w:tcPr>
-            <w:tcW w:type="dxa" w:w="3500"/>
-            <w:tcBorders>
-              <w:top w:val="single" w:color="BFC7CC" w:sz="4"/>
-              <w:left w:val="single" w:color="BFC7CC" w:sz="4"/>
-              <w:bottom w:val="single" w:color="BFC7CC" w:sz="4"/>
-              <w:right w:val="single" w:color="BFC7CC" w:sz="4"/>
-            </w:tcBorders>
-            <w:tcMar>
-              <w:top w:type="dxa" w:w="50"/>
-              <w:left w:type="dxa" w:w="90"/>
-              <w:bottom w:type="dxa" w:w="50"/>
-              <w:right w:type="dxa" w:w="90"/>
-            </w:tcMar>
-          </w:tcPr>
-          <w:p>
-            <w:r>
-              <w:rPr>
-                <w:sz w:val="18"/>
-                <w:szCs w:val="18"/>
-              </w:rPr>
-              <w:t xml:space="preserve">most-frequent imputation</w:t>
-            </w:r>
-          </w:p>
-        </w:tc>
-      </w:tr>
-      <w:tr>
-        <w:tc>
-          <w:tcPr>
-            <w:tcW w:type="dxa" w:w="1400"/>
-            <w:tcBorders>
-              <w:top w:val="single" w:color="BFC7CC" w:sz="4"/>
-              <w:left w:val="single" w:color="BFC7CC" w:sz="4"/>
-              <w:bottom w:val="single" w:color="BFC7CC" w:sz="4"/>
-              <w:right w:val="single" w:color="BFC7CC" w:sz="4"/>
-            </w:tcBorders>
-            <w:tcMar>
-              <w:top w:type="dxa" w:w="50"/>
-              <w:left w:type="dxa" w:w="90"/>
-              <w:bottom w:type="dxa" w:w="50"/>
-              <w:right w:type="dxa" w:w="90"/>
-            </w:tcMar>
-          </w:tcPr>
-          <w:p>
-            <w:r>
-              <w:rPr>
-                <w:sz w:val="18"/>
-                <w:szCs w:val="18"/>
-              </w:rPr>
-              <w:t xml:space="preserve">Nominal</w:t>
-            </w:r>
-          </w:p>
-        </w:tc>
-        <w:tc>
-          <w:tcPr>
-            <w:tcW w:type="dxa" w:w="4126"/>
-            <w:tcBorders>
-              <w:top w:val="single" w:color="BFC7CC" w:sz="4"/>
-              <w:left w:val="single" w:color="BFC7CC" w:sz="4"/>
-              <w:bottom w:val="single" w:color="BFC7CC" w:sz="4"/>
-              <w:right w:val="single" w:color="BFC7CC" w:sz="4"/>
-            </w:tcBorders>
-            <w:tcMar>
-              <w:top w:type="dxa" w:w="50"/>
-              <w:left w:type="dxa" w:w="90"/>
-              <w:bottom w:type="dxa" w:w="50"/>
-              <w:right w:type="dxa" w:w="90"/>
-            </w:tcMar>
-          </w:tcPr>
-          <w:p>
-            <w:r>
-              <w:rPr>
-                <w:sz w:val="18"/>
-                <w:szCs w:val="18"/>
-              </w:rPr>
-              <w:t xml:space="preserve">cp, restecg, slope, thal</w:t>
-            </w:r>
-          </w:p>
-        </w:tc>
-        <w:tc>
-          <w:tcPr>
-            <w:tcW w:type="dxa" w:w="3500"/>
-            <w:tcBorders>
-              <w:top w:val="single" w:color="BFC7CC" w:sz="4"/>
-              <w:left w:val="single" w:color="BFC7CC" w:sz="4"/>
-              <w:bottom w:val="single" w:color="BFC7CC" w:sz="4"/>
-              <w:right w:val="single" w:color="BFC7CC" w:sz="4"/>
-            </w:tcBorders>
-            <w:tcMar>
-              <w:top w:type="dxa" w:w="50"/>
-              <w:left w:type="dxa" w:w="90"/>
-              <w:bottom w:type="dxa" w:w="50"/>
-              <w:right w:type="dxa" w:w="90"/>
-            </w:tcMar>
-          </w:tcPr>
-          <w:p>
-            <w:r>
-              <w:rPr>
-                <w:sz w:val="18"/>
-                <w:szCs w:val="18"/>
-              </w:rPr>
-              <w:t xml:space="preserve">most-frequent imputation, one-hot (unknown codes ignored)</w:t>
-            </w:r>
-          </w:p>
-        </w:tc>
-      </w:tr>
-    </w:tbl>
-    <w:p>
-      <w:pPr>
-        <w:spacing w:after="120" w:before="120"/>
-      </w:pPr>
-      <w:r>
-        <w:t xml:space="preserve">The adder, the ColumnTransformer and the estimator form one scikit-learn </w:t>
-      </w:r>
-      <w:r>
-        <w:rPr>
-          <w:rFonts w:ascii="Consolas" w:cs="Consolas" w:eastAsia="Consolas" w:hAnsi="Consolas"/>
-          <w:sz w:val="19"/>
-          <w:szCs w:val="19"/>
-        </w:rPr>
-        <w:t xml:space="preserve">Pipeline</w:t>
-      </w:r>
-      <w:r>
-        <w:t xml:space="preserve">, so raw JSON fields go in and probabilities come out identically in training, the CLI and the API.</w:t>
-      </w:r>
-    </w:p>
-    <w:tbl>
-      <w:tblPr>
-        <w:tblW w:type="dxa" w:w="9026"/>
-        <w:tblBorders>
-          <w:top w:val="single" w:color="auto" w:sz="4"/>
-          <w:left w:val="single" w:color="auto" w:sz="4"/>
-          <w:bottom w:val="single" w:color="auto" w:sz="4"/>
-          <w:right w:val="single" w:color="auto" w:sz="4"/>
-          <w:insideH w:val="single" w:color="auto" w:sz="4"/>
-          <w:insideV w:val="single" w:color="auto" w:sz="4"/>
-        </w:tblBorders>
-      </w:tblPr>
-      <w:tblGrid>
-        <w:gridCol w:w="2300"/>
-        <w:gridCol w:w="3863"/>
-        <w:gridCol w:w="2863"/>
-      </w:tblGrid>
-      <w:tr>
-        <w:trPr>
-          <w:tblHeader/>
-        </w:trPr>
-        <w:tc>
-          <w:tcPr>
-            <w:tcW w:type="dxa" w:w="2300"/>
-            <w:tcBorders>
-              <w:top w:val="single" w:color="BFC7CC" w:sz="4"/>
-              <w:left w:val="single" w:color="BFC7CC" w:sz="4"/>
-              <w:bottom w:val="single" w:color="BFC7CC" w:sz="4"/>
-              <w:right w:val="single" w:color="BFC7CC" w:sz="4"/>
-            </w:tcBorders>
-            <w:shd w:fill="DCE8EC" w:color="auto" w:val="clear"/>
-            <w:tcMar>
-              <w:top w:type="dxa" w:w="50"/>
-              <w:left w:type="dxa" w:w="90"/>
-              <w:bottom w:type="dxa" w:w="50"/>
-              <w:right w:type="dxa" w:w="90"/>
-            </w:tcMar>
-          </w:tcPr>
-          <w:p>
-            <w:r>
-              <w:rPr>
-                <w:b/>
-                <w:bCs/>
-                <w:sz w:val="18"/>
-                <w:szCs w:val="18"/>
-              </w:rPr>
-              <w:t xml:space="preserve">Model</w:t>
-            </w:r>
-          </w:p>
-        </w:tc>
-        <w:tc>
-          <w:tcPr>
-            <w:tcW w:type="dxa" w:w="3863"/>
-            <w:tcBorders>
-              <w:top w:val="single" w:color="BFC7CC" w:sz="4"/>
-              <w:left w:val="single" w:color="BFC7CC" w:sz="4"/>
-              <w:bottom w:val="single" w:color="BFC7CC" w:sz="4"/>
-              <w:right w:val="single" w:color="BFC7CC" w:sz="4"/>
-            </w:tcBorders>
-            <w:shd w:fill="DCE8EC" w:color="auto" w:val="clear"/>
-            <w:tcMar>
-              <w:top w:type="dxa" w:w="50"/>
-              <w:left w:type="dxa" w:w="90"/>
-              <w:bottom w:type="dxa" w:w="50"/>
-              <w:right w:type="dxa" w:w="90"/>
-            </w:tcMar>
-          </w:tcPr>
-          <w:p>
-            <w:r>
-              <w:rPr>
-                <w:b/>
-                <w:bCs/>
-                <w:sz w:val="18"/>
-                <w:szCs w:val="18"/>
-              </w:rPr>
-              <w:t xml:space="preserve">Grid (candidates)</w:t>
-            </w:r>
-          </w:p>
-        </w:tc>
-        <w:tc>
-          <w:tcPr>
-            <w:tcW w:type="dxa" w:w="2863"/>
-            <w:tcBorders>
-              <w:top w:val="single" w:color="BFC7CC" w:sz="4"/>
-              <w:left w:val="single" w:color="BFC7CC" w:sz="4"/>
-              <w:bottom w:val="single" w:color="BFC7CC" w:sz="4"/>
-              <w:right w:val="single" w:color="BFC7CC" w:sz="4"/>
-            </w:tcBorders>
-            <w:shd w:fill="DCE8EC" w:color="auto" w:val="clear"/>
-            <w:tcMar>
-              <w:top w:type="dxa" w:w="50"/>
-              <w:left w:type="dxa" w:w="90"/>
-              <w:bottom w:type="dxa" w:w="50"/>
-              <w:right w:type="dxa" w:w="90"/>
-            </w:tcMar>
-          </w:tcPr>
-          <w:p>
-            <w:r>
-              <w:rPr>
-                <w:b/>
-                <w:bCs/>
-                <w:sz w:val="18"/>
-                <w:szCs w:val="18"/>
-              </w:rPr>
-              <w:t xml:space="preserve">Best parameters</w:t>
-            </w:r>
-          </w:p>
-        </w:tc>
-      </w:tr>
-      <w:tr>
-        <w:tc>
-          <w:tcPr>
-            <w:tcW w:type="dxa" w:w="2300"/>
-            <w:tcBorders>
-              <w:top w:val="single" w:color="BFC7CC" w:sz="4"/>
-              <w:left w:val="single" w:color="BFC7CC" w:sz="4"/>
-              <w:bottom w:val="single" w:color="BFC7CC" w:sz="4"/>
-              <w:right w:val="single" w:color="BFC7CC" w:sz="4"/>
-            </w:tcBorders>
-            <w:tcMar>
-              <w:top w:type="dxa" w:w="50"/>
-              <w:left w:type="dxa" w:w="90"/>
-              <w:bottom w:type="dxa" w:w="50"/>
-              <w:right w:type="dxa" w:w="90"/>
-            </w:tcMar>
-          </w:tcPr>
-          <w:p>
-            <w:r>
-              <w:rPr>
-                <w:sz w:val="18"/>
-                <w:szCs w:val="18"/>
-              </w:rPr>
-              <w:t xml:space="preserve">Logistic Regression (saga)</w:t>
-            </w:r>
-          </w:p>
-        </w:tc>
-        <w:tc>
-          <w:tcPr>
-            <w:tcW w:type="dxa" w:w="3863"/>
-            <w:tcBorders>
-              <w:top w:val="single" w:color="BFC7CC" w:sz="4"/>
-              <w:left w:val="single" w:color="BFC7CC" w:sz="4"/>
-              <w:bottom w:val="single" w:color="BFC7CC" w:sz="4"/>
-              <w:right w:val="single" w:color="BFC7CC" w:sz="4"/>
-            </w:tcBorders>
-            <w:tcMar>
-              <w:top w:type="dxa" w:w="50"/>
-              <w:left w:type="dxa" w:w="90"/>
-              <w:bottom w:type="dxa" w:w="50"/>
-              <w:right w:type="dxa" w:w="90"/>
-            </w:tcMar>
-          </w:tcPr>
-          <w:p>
-            <w:r>
-              <w:rPr>
-                <w:sz w:val="18"/>
-                <w:szCs w:val="18"/>
-              </w:rPr>
-              <w:t xml:space="preserve">C {0.01, 0.1, 1, 10} x l1_ratio {0, 0.5, 1} x class_weight (24)</w:t>
-            </w:r>
-          </w:p>
-        </w:tc>
-        <w:tc>
-          <w:tcPr>
-            <w:tcW w:type="dxa" w:w="2863"/>
-            <w:tcBorders>
-              <w:top w:val="single" w:color="BFC7CC" w:sz="4"/>
-              <w:left w:val="single" w:color="BFC7CC" w:sz="4"/>
-              <w:bottom w:val="single" w:color="BFC7CC" w:sz="4"/>
-              <w:right w:val="single" w:color="BFC7CC" w:sz="4"/>
-            </w:tcBorders>
-            <w:tcMar>
-              <w:top w:type="dxa" w:w="50"/>
-              <w:left w:type="dxa" w:w="90"/>
-              <w:bottom w:type="dxa" w:w="50"/>
-              <w:right w:type="dxa" w:w="90"/>
-            </w:tcMar>
-          </w:tcPr>
-          <w:p>
-            <w:r>
-              <w:rPr>
-                <w:sz w:val="18"/>
-                <w:szCs w:val="18"/>
-              </w:rPr>
-              <w:t xml:space="preserve">C = 1.0, l1_ratio = 0.5 (elastic net), balanced</w:t>
-            </w:r>
-          </w:p>
-        </w:tc>
-      </w:tr>
-      <w:tr>
-        <w:tc>
-          <w:tcPr>
-            <w:tcW w:type="dxa" w:w="2300"/>
-            <w:tcBorders>
-              <w:top w:val="single" w:color="BFC7CC" w:sz="4"/>
-              <w:left w:val="single" w:color="BFC7CC" w:sz="4"/>
-              <w:bottom w:val="single" w:color="BFC7CC" w:sz="4"/>
-              <w:right w:val="single" w:color="BFC7CC" w:sz="4"/>
-            </w:tcBorders>
-            <w:tcMar>
-              <w:top w:type="dxa" w:w="50"/>
-              <w:left w:type="dxa" w:w="90"/>
-              <w:bottom w:type="dxa" w:w="50"/>
-              <w:right w:type="dxa" w:w="90"/>
-            </w:tcMar>
-          </w:tcPr>
-          <w:p>
-            <w:r>
-              <w:rPr>
-                <w:sz w:val="18"/>
-                <w:szCs w:val="18"/>
-              </w:rPr>
-              <w:t xml:space="preserve">Random Forest (300 trees)</w:t>
-            </w:r>
-          </w:p>
-        </w:tc>
-        <w:tc>
-          <w:tcPr>
-            <w:tcW w:type="dxa" w:w="3863"/>
-            <w:tcBorders>
-              <w:top w:val="single" w:color="BFC7CC" w:sz="4"/>
-              <w:left w:val="single" w:color="BFC7CC" w:sz="4"/>
-              <w:bottom w:val="single" w:color="BFC7CC" w:sz="4"/>
-              <w:right w:val="single" w:color="BFC7CC" w:sz="4"/>
-            </w:tcBorders>
-            <w:tcMar>
-              <w:top w:type="dxa" w:w="50"/>
-              <w:left w:type="dxa" w:w="90"/>
-              <w:bottom w:type="dxa" w:w="50"/>
-              <w:right w:type="dxa" w:w="90"/>
-            </w:tcMar>
-          </w:tcPr>
-          <w:p>
-            <w:r>
-              <w:rPr>
-                <w:sz w:val="18"/>
-                <w:szCs w:val="18"/>
-              </w:rPr>
-              <w:t xml:space="preserve">max_depth x min_samples_leaf x max_features x class_weight (24)</w:t>
-            </w:r>
-          </w:p>
-        </w:tc>
-        <w:tc>
-          <w:tcPr>
-            <w:tcW w:type="dxa" w:w="2863"/>
-            <w:tcBorders>
-              <w:top w:val="single" w:color="BFC7CC" w:sz="4"/>
-              <w:left w:val="single" w:color="BFC7CC" w:sz="4"/>
-              <w:bottom w:val="single" w:color="BFC7CC" w:sz="4"/>
-              <w:right w:val="single" w:color="BFC7CC" w:sz="4"/>
-            </w:tcBorders>
-            <w:tcMar>
-              <w:top w:type="dxa" w:w="50"/>
-              <w:left w:type="dxa" w:w="90"/>
-              <w:bottom w:type="dxa" w:w="50"/>
-              <w:right w:type="dxa" w:w="90"/>
-            </w:tcMar>
-          </w:tcPr>
-          <w:p>
-            <w:r>
-              <w:rPr>
-                <w:sz w:val="18"/>
-                <w:szCs w:val="18"/>
-              </w:rPr>
-              <w:t xml:space="preserve">max_depth None, min_samples_leaf 4, max_features 0.5</w:t>
-            </w:r>
-          </w:p>
-        </w:tc>
-      </w:tr>
-      <w:tr>
-        <w:tc>
-          <w:tcPr>
-            <w:tcW w:type="dxa" w:w="2300"/>
-            <w:tcBorders>
-              <w:top w:val="single" w:color="BFC7CC" w:sz="4"/>
-              <w:left w:val="single" w:color="BFC7CC" w:sz="4"/>
-              <w:bottom w:val="single" w:color="BFC7CC" w:sz="4"/>
-              <w:right w:val="single" w:color="BFC7CC" w:sz="4"/>
-            </w:tcBorders>
-            <w:tcMar>
-              <w:top w:type="dxa" w:w="50"/>
-              <w:left w:type="dxa" w:w="90"/>
-              <w:bottom w:type="dxa" w:w="50"/>
-              <w:right w:type="dxa" w:w="90"/>
-            </w:tcMar>
-          </w:tcPr>
-          <w:p>
-            <w:r>
-              <w:rPr>
-                <w:sz w:val="18"/>
-                <w:szCs w:val="18"/>
-              </w:rPr>
-              <w:t xml:space="preserve">Gradient Boosting</w:t>
-            </w:r>
-          </w:p>
-        </w:tc>
-        <w:tc>
-          <w:tcPr>
-            <w:tcW w:type="dxa" w:w="3863"/>
-            <w:tcBorders>
-              <w:top w:val="single" w:color="BFC7CC" w:sz="4"/>
-              <w:left w:val="single" w:color="BFC7CC" w:sz="4"/>
-              <w:bottom w:val="single" w:color="BFC7CC" w:sz="4"/>
-              <w:right w:val="single" w:color="BFC7CC" w:sz="4"/>
-            </w:tcBorders>
-            <w:tcMar>
-              <w:top w:type="dxa" w:w="50"/>
-              <w:left w:type="dxa" w:w="90"/>
-              <w:bottom w:type="dxa" w:w="50"/>
-              <w:right w:type="dxa" w:w="90"/>
-            </w:tcMar>
-          </w:tcPr>
-          <w:p>
-            <w:r>
-              <w:rPr>
-                <w:sz w:val="18"/>
-                <w:szCs w:val="18"/>
-              </w:rPr>
-              <w:t xml:space="preserve">n_estimators x learning_rate x max_depth x subsample (16)</w:t>
-            </w:r>
-          </w:p>
-        </w:tc>
-        <w:tc>
-          <w:tcPr>
-            <w:tcW w:type="dxa" w:w="2863"/>
-            <w:tcBorders>
-              <w:top w:val="single" w:color="BFC7CC" w:sz="4"/>
-              <w:left w:val="single" w:color="BFC7CC" w:sz="4"/>
-              <w:bottom w:val="single" w:color="BFC7CC" w:sz="4"/>
-              <w:right w:val="single" w:color="BFC7CC" w:sz="4"/>
-            </w:tcBorders>
-            <w:tcMar>
-              <w:top w:type="dxa" w:w="50"/>
-              <w:left w:type="dxa" w:w="90"/>
-              <w:bottom w:type="dxa" w:w="50"/>
-              <w:right w:type="dxa" w:w="90"/>
-            </w:tcMar>
-          </w:tcPr>
-          <w:p>
-            <w:r>
-              <w:rPr>
-                <w:sz w:val="18"/>
-                <w:szCs w:val="18"/>
-              </w:rPr>
-              <w:t xml:space="preserve">100 trees, learning_rate 0.03, depth 2, subsample 0.8</w:t>
-            </w:r>
-          </w:p>
-        </w:tc>
-      </w:tr>
-    </w:tbl>
-    <w:p>
-      <w:pPr>
-        <w:spacing w:after="120" w:before="120"/>
-      </w:pPr>
-      <w:r>
-        <w:t xml:space="preserve">Data are split 80/20 with stratification (242 training, 61 test patients). Each candidate is scored by stratified 5-fold cross-validation on accuracy, precision, recall, F1 and ROC-AUC, refitting on ROC-AUC because it is threshold-independent and robust to the mild imbalance. Recall is reported alongside it because a missed diagnosis is costlier than a false alarm. Logistic regression wins on CV ROC-AUC and also shows the smallest train/validation gap (0.932 vs 0.909), whereas the random forest overfits (0.985 vs 0.894).</w:t>
+        <w:t xml:space="preserve">Continuous features by diagnosis. The engineered ratio thalach / (220 - age) separates the classes.</w:t>
       </w:r>
     </w:p>
     <w:p>
@@ -2958,9 +1998,9 @@
       <w:r>
         <w:drawing>
           <wp:inline distT="0" distB="0" distL="0" distR="0">
-            <wp:extent cx="5591175" cy="2762250"/>
+            <wp:extent cx="5715000" cy="2647950"/>
             <wp:effectExtent t="0" r="0" b="0" l="0"/>
-            <wp:docPr id="6" name="model_comparison.png" descr="Cross-validated metrics (mean +/- std) of the best configuration of each model family." title="Cross-validated metrics (mean +/- std) of the best configuration of each model family."/>
+            <wp:docPr id="5" name="eda_categorical_risk.png" descr="Disease rate per category (dashed line: overall rate 46 %)." title="Disease rate per category (dashed line: overall rate 46 %)."/>
             <wp:cNvGraphicFramePr>
               <a:graphicFrameLocks xmlns:a="http://schemas.openxmlformats.org/drawingml/2006/main" noChangeAspect="1"/>
             </wp:cNvGraphicFramePr>
@@ -2983,6 +2023,1020 @@
                   <pic:spPr bwMode="auto">
                     <a:xfrm>
                       <a:off x="0" y="0"/>
+                      <a:ext cx="5715000" cy="2647950"/>
+                    </a:xfrm>
+                    <a:prstGeom prst="rect">
+                      <a:avLst/>
+                    </a:prstGeom>
+                  </pic:spPr>
+                </pic:pic>
+              </a:graphicData>
+            </a:graphic>
+          </wp:inline>
+        </w:drawing>
+      </w:r>
+    </w:p>
+    <w:p>
+      <w:pPr>
+        <w:spacing w:after="200"/>
+        <w:jc w:val="center"/>
+      </w:pPr>
+      <w:r>
+        <w:rPr>
+          <w:b/>
+          <w:bCs/>
+          <w:color w:val="555555"/>
+          <w:sz w:val="18"/>
+          <w:szCs w:val="18"/>
+        </w:rPr>
+        <w:t xml:space="preserve">Figure 4. </w:t>
+      </w:r>
+      <w:r>
+        <w:rPr>
+          <w:i/>
+          <w:iCs/>
+          <w:color w:val="555555"/>
+          <w:sz w:val="18"/>
+          <w:szCs w:val="18"/>
+        </w:rPr>
+        <w:t xml:space="preserve">Disease rate per category (dashed line: overall rate 46 %).</w:t>
+      </w:r>
+    </w:p>
+    <w:p>
+      <w:pPr>
+        <w:spacing w:after="120" w:line="276"/>
+      </w:pPr>
+      <w:r>
+        <w:t xml:space="preserve">Key findings:</w:t>
+      </w:r>
+    </w:p>
+    <w:p>
+      <w:pPr>
+        <w:pStyle w:val="ListParagraph"/>
+        <w:numPr>
+          <w:ilvl w:val="0"/>
+          <w:numId w:val="3"/>
+        </w:numPr>
+        <w:spacing w:after="60"/>
+      </w:pPr>
+      <w:r>
+        <w:t xml:space="preserve">Stress-test and imaging features dominate: </w:t>
+      </w:r>
+      <w:r>
+        <w:rPr>
+          <w:rFonts w:ascii="Consolas" w:cs="Consolas" w:eastAsia="Consolas" w:hAnsi="Consolas"/>
+          <w:sz w:val="19"/>
+          <w:szCs w:val="19"/>
+        </w:rPr>
+        <w:t xml:space="preserve">thal</w:t>
+      </w:r>
+      <w:r>
+        <w:t xml:space="preserve"> (Spearman 0.52), </w:t>
+      </w:r>
+      <w:r>
+        <w:rPr>
+          <w:rFonts w:ascii="Consolas" w:cs="Consolas" w:eastAsia="Consolas" w:hAnsi="Consolas"/>
+          <w:sz w:val="19"/>
+          <w:szCs w:val="19"/>
+        </w:rPr>
+        <w:t xml:space="preserve">ca</w:t>
+      </w:r>
+      <w:r>
+        <w:t xml:space="preserve"> (0.49), </w:t>
+      </w:r>
+      <w:r>
+        <w:rPr>
+          <w:rFonts w:ascii="Consolas" w:cs="Consolas" w:eastAsia="Consolas" w:hAnsi="Consolas"/>
+          <w:sz w:val="19"/>
+          <w:szCs w:val="19"/>
+        </w:rPr>
+        <w:t xml:space="preserve">cp</w:t>
+      </w:r>
+      <w:r>
+        <w:t xml:space="preserve"> (0.47), </w:t>
+      </w:r>
+      <w:r>
+        <w:rPr>
+          <w:rFonts w:ascii="Consolas" w:cs="Consolas" w:eastAsia="Consolas" w:hAnsi="Consolas"/>
+          <w:sz w:val="19"/>
+          <w:szCs w:val="19"/>
+        </w:rPr>
+        <w:t xml:space="preserve">exang</w:t>
+      </w:r>
+      <w:r>
+        <w:t xml:space="preserve"> (0.43), </w:t>
+      </w:r>
+      <w:r>
+        <w:rPr>
+          <w:rFonts w:ascii="Consolas" w:cs="Consolas" w:eastAsia="Consolas" w:hAnsi="Consolas"/>
+          <w:sz w:val="19"/>
+          <w:szCs w:val="19"/>
+        </w:rPr>
+        <w:t xml:space="preserve">oldpeak</w:t>
+      </w:r>
+      <w:r>
+        <w:t xml:space="preserve"> (0.41) and </w:t>
+      </w:r>
+      <w:r>
+        <w:rPr>
+          <w:rFonts w:ascii="Consolas" w:cs="Consolas" w:eastAsia="Consolas" w:hAnsi="Consolas"/>
+          <w:sz w:val="19"/>
+          <w:szCs w:val="19"/>
+        </w:rPr>
+        <w:t xml:space="preserve">thalach</w:t>
+      </w:r>
+      <w:r>
+        <w:t xml:space="preserve"> (-0.42). Fasting blood sugar is uninformative (0.03).</w:t>
+      </w:r>
+    </w:p>
+    <w:p>
+      <w:pPr>
+        <w:pStyle w:val="ListParagraph"/>
+        <w:numPr>
+          <w:ilvl w:val="0"/>
+          <w:numId w:val="3"/>
+        </w:numPr>
+        <w:spacing w:after="60"/>
+      </w:pPr>
+      <w:r>
+        <w:t xml:space="preserve">Asymptomatic chest pain carries a 73 % disease rate, against 18 to 30 % for the other types; one or more vessels on fluoroscopy raises it to 68 to 85 %.</w:t>
+      </w:r>
+    </w:p>
+    <w:p>
+      <w:pPr>
+        <w:pStyle w:val="ListParagraph"/>
+        <w:numPr>
+          <w:ilvl w:val="0"/>
+          <w:numId w:val="3"/>
+        </w:numPr>
+        <w:spacing w:after="60"/>
+      </w:pPr>
+      <w:r>
+        <w:t xml:space="preserve">Diseased patients are older and reach a lower maximum heart rate. Because maximum heart rate falls with age, the age-normalised ratio was engineered as a feature.</w:t>
+      </w:r>
+    </w:p>
+    <w:p>
+      <w:pPr>
+        <w:pStyle w:val="ListParagraph"/>
+        <w:numPr>
+          <w:ilvl w:val="0"/>
+          <w:numId w:val="3"/>
+        </w:numPr>
+        <w:spacing w:after="60"/>
+      </w:pPr>
+      <w:r>
+        <w:t xml:space="preserve">No feature pair exceeds |rho| = 0.6, so all 13 features are kept and regularisation is left to tuning.</w:t>
+      </w:r>
+    </w:p>
+    <w:p>
+      <w:pPr>
+        <w:pStyle w:val="Heading1"/>
+      </w:pPr>
+      <w:r>
+        <w:t xml:space="preserve">5. Feature engineering and model development</w:t>
+      </w:r>
+    </w:p>
+    <w:tbl>
+      <w:tblPr>
+        <w:tblW w:type="dxa" w:w="9026"/>
+        <w:tblBorders>
+          <w:top w:val="single" w:color="auto" w:sz="4"/>
+          <w:left w:val="single" w:color="auto" w:sz="4"/>
+          <w:bottom w:val="single" w:color="auto" w:sz="4"/>
+          <w:right w:val="single" w:color="auto" w:sz="4"/>
+          <w:insideH w:val="single" w:color="auto" w:sz="4"/>
+          <w:insideV w:val="single" w:color="auto" w:sz="4"/>
+        </w:tblBorders>
+      </w:tblPr>
+      <w:tblGrid>
+        <w:gridCol w:w="1400"/>
+        <w:gridCol w:w="4126"/>
+        <w:gridCol w:w="3500"/>
+      </w:tblGrid>
+      <w:tr>
+        <w:trPr>
+          <w:tblHeader/>
+        </w:trPr>
+        <w:tc>
+          <w:tcPr>
+            <w:tcW w:type="dxa" w:w="1400"/>
+            <w:tcBorders>
+              <w:top w:val="single" w:color="BFC7CC" w:sz="4"/>
+              <w:left w:val="single" w:color="BFC7CC" w:sz="4"/>
+              <w:bottom w:val="single" w:color="BFC7CC" w:sz="4"/>
+              <w:right w:val="single" w:color="BFC7CC" w:sz="4"/>
+            </w:tcBorders>
+            <w:shd w:fill="DCE8EC" w:color="auto" w:val="clear"/>
+            <w:tcMar>
+              <w:top w:type="dxa" w:w="50"/>
+              <w:left w:type="dxa" w:w="90"/>
+              <w:bottom w:type="dxa" w:w="50"/>
+              <w:right w:type="dxa" w:w="90"/>
+            </w:tcMar>
+          </w:tcPr>
+          <w:p>
+            <w:r>
+              <w:rPr>
+                <w:b/>
+                <w:bCs/>
+                <w:sz w:val="18"/>
+                <w:szCs w:val="18"/>
+              </w:rPr>
+              <w:t xml:space="preserve">Group</w:t>
+            </w:r>
+          </w:p>
+        </w:tc>
+        <w:tc>
+          <w:tcPr>
+            <w:tcW w:type="dxa" w:w="4126"/>
+            <w:tcBorders>
+              <w:top w:val="single" w:color="BFC7CC" w:sz="4"/>
+              <w:left w:val="single" w:color="BFC7CC" w:sz="4"/>
+              <w:bottom w:val="single" w:color="BFC7CC" w:sz="4"/>
+              <w:right w:val="single" w:color="BFC7CC" w:sz="4"/>
+            </w:tcBorders>
+            <w:shd w:fill="DCE8EC" w:color="auto" w:val="clear"/>
+            <w:tcMar>
+              <w:top w:type="dxa" w:w="50"/>
+              <w:left w:type="dxa" w:w="90"/>
+              <w:bottom w:type="dxa" w:w="50"/>
+              <w:right w:type="dxa" w:w="90"/>
+            </w:tcMar>
+          </w:tcPr>
+          <w:p>
+            <w:r>
+              <w:rPr>
+                <w:b/>
+                <w:bCs/>
+                <w:sz w:val="18"/>
+                <w:szCs w:val="18"/>
+              </w:rPr>
+              <w:t xml:space="preserve">Columns</w:t>
+            </w:r>
+          </w:p>
+        </w:tc>
+        <w:tc>
+          <w:tcPr>
+            <w:tcW w:type="dxa" w:w="3500"/>
+            <w:tcBorders>
+              <w:top w:val="single" w:color="BFC7CC" w:sz="4"/>
+              <w:left w:val="single" w:color="BFC7CC" w:sz="4"/>
+              <w:bottom w:val="single" w:color="BFC7CC" w:sz="4"/>
+              <w:right w:val="single" w:color="BFC7CC" w:sz="4"/>
+            </w:tcBorders>
+            <w:shd w:fill="DCE8EC" w:color="auto" w:val="clear"/>
+            <w:tcMar>
+              <w:top w:type="dxa" w:w="50"/>
+              <w:left w:type="dxa" w:w="90"/>
+              <w:bottom w:type="dxa" w:w="50"/>
+              <w:right w:type="dxa" w:w="90"/>
+            </w:tcMar>
+          </w:tcPr>
+          <w:p>
+            <w:r>
+              <w:rPr>
+                <w:b/>
+                <w:bCs/>
+                <w:sz w:val="18"/>
+                <w:szCs w:val="18"/>
+              </w:rPr>
+              <w:t xml:space="preserve">Transformation</w:t>
+            </w:r>
+          </w:p>
+        </w:tc>
+      </w:tr>
+      <w:tr>
+        <w:tc>
+          <w:tcPr>
+            <w:tcW w:type="dxa" w:w="1400"/>
+            <w:tcBorders>
+              <w:top w:val="single" w:color="BFC7CC" w:sz="4"/>
+              <w:left w:val="single" w:color="BFC7CC" w:sz="4"/>
+              <w:bottom w:val="single" w:color="BFC7CC" w:sz="4"/>
+              <w:right w:val="single" w:color="BFC7CC" w:sz="4"/>
+            </w:tcBorders>
+            <w:tcMar>
+              <w:top w:type="dxa" w:w="50"/>
+              <w:left w:type="dxa" w:w="90"/>
+              <w:bottom w:type="dxa" w:w="50"/>
+              <w:right w:type="dxa" w:w="90"/>
+            </w:tcMar>
+          </w:tcPr>
+          <w:p>
+            <w:r>
+              <w:rPr>
+                <w:sz w:val="18"/>
+                <w:szCs w:val="18"/>
+              </w:rPr>
+              <w:t xml:space="preserve">Numeric</w:t>
+            </w:r>
+          </w:p>
+        </w:tc>
+        <w:tc>
+          <w:tcPr>
+            <w:tcW w:type="dxa" w:w="4126"/>
+            <w:tcBorders>
+              <w:top w:val="single" w:color="BFC7CC" w:sz="4"/>
+              <w:left w:val="single" w:color="BFC7CC" w:sz="4"/>
+              <w:bottom w:val="single" w:color="BFC7CC" w:sz="4"/>
+              <w:right w:val="single" w:color="BFC7CC" w:sz="4"/>
+            </w:tcBorders>
+            <w:tcMar>
+              <w:top w:type="dxa" w:w="50"/>
+              <w:left w:type="dxa" w:w="90"/>
+              <w:bottom w:type="dxa" w:w="50"/>
+              <w:right w:type="dxa" w:w="90"/>
+            </w:tcMar>
+          </w:tcPr>
+          <w:p>
+            <w:r>
+              <w:rPr>
+                <w:sz w:val="18"/>
+                <w:szCs w:val="18"/>
+              </w:rPr>
+              <w:t xml:space="preserve">age, trestbps, chol, thalach, oldpeak, ca</w:t>
+            </w:r>
+          </w:p>
+        </w:tc>
+        <w:tc>
+          <w:tcPr>
+            <w:tcW w:type="dxa" w:w="3500"/>
+            <w:tcBorders>
+              <w:top w:val="single" w:color="BFC7CC" w:sz="4"/>
+              <w:left w:val="single" w:color="BFC7CC" w:sz="4"/>
+              <w:bottom w:val="single" w:color="BFC7CC" w:sz="4"/>
+              <w:right w:val="single" w:color="BFC7CC" w:sz="4"/>
+            </w:tcBorders>
+            <w:tcMar>
+              <w:top w:type="dxa" w:w="50"/>
+              <w:left w:type="dxa" w:w="90"/>
+              <w:bottom w:type="dxa" w:w="50"/>
+              <w:right w:type="dxa" w:w="90"/>
+            </w:tcMar>
+          </w:tcPr>
+          <w:p>
+            <w:r>
+              <w:rPr>
+                <w:sz w:val="18"/>
+                <w:szCs w:val="18"/>
+              </w:rPr>
+              <w:t xml:space="preserve">median imputation, standard scaling</w:t>
+            </w:r>
+          </w:p>
+        </w:tc>
+      </w:tr>
+      <w:tr>
+        <w:tc>
+          <w:tcPr>
+            <w:tcW w:type="dxa" w:w="1400"/>
+            <w:tcBorders>
+              <w:top w:val="single" w:color="BFC7CC" w:sz="4"/>
+              <w:left w:val="single" w:color="BFC7CC" w:sz="4"/>
+              <w:bottom w:val="single" w:color="BFC7CC" w:sz="4"/>
+              <w:right w:val="single" w:color="BFC7CC" w:sz="4"/>
+            </w:tcBorders>
+            <w:tcMar>
+              <w:top w:type="dxa" w:w="50"/>
+              <w:left w:type="dxa" w:w="90"/>
+              <w:bottom w:type="dxa" w:w="50"/>
+              <w:right w:type="dxa" w:w="90"/>
+            </w:tcMar>
+          </w:tcPr>
+          <w:p>
+            <w:r>
+              <w:rPr>
+                <w:sz w:val="18"/>
+                <w:szCs w:val="18"/>
+              </w:rPr>
+              <w:t xml:space="preserve">Engineered</w:t>
+            </w:r>
+          </w:p>
+        </w:tc>
+        <w:tc>
+          <w:tcPr>
+            <w:tcW w:type="dxa" w:w="4126"/>
+            <w:tcBorders>
+              <w:top w:val="single" w:color="BFC7CC" w:sz="4"/>
+              <w:left w:val="single" w:color="BFC7CC" w:sz="4"/>
+              <w:bottom w:val="single" w:color="BFC7CC" w:sz="4"/>
+              <w:right w:val="single" w:color="BFC7CC" w:sz="4"/>
+            </w:tcBorders>
+            <w:tcMar>
+              <w:top w:type="dxa" w:w="50"/>
+              <w:left w:type="dxa" w:w="90"/>
+              <w:bottom w:type="dxa" w:w="50"/>
+              <w:right w:type="dxa" w:w="90"/>
+            </w:tcMar>
+          </w:tcPr>
+          <w:p>
+            <w:r>
+              <w:rPr>
+                <w:sz w:val="18"/>
+                <w:szCs w:val="18"/>
+              </w:rPr>
+              <w:t xml:space="preserve">pct_max_hr = thalach / (220 - age); bp_stage (ACC/AHA 2017, 0 to 3)</w:t>
+            </w:r>
+          </w:p>
+        </w:tc>
+        <w:tc>
+          <w:tcPr>
+            <w:tcW w:type="dxa" w:w="3500"/>
+            <w:tcBorders>
+              <w:top w:val="single" w:color="BFC7CC" w:sz="4"/>
+              <w:left w:val="single" w:color="BFC7CC" w:sz="4"/>
+              <w:bottom w:val="single" w:color="BFC7CC" w:sz="4"/>
+              <w:right w:val="single" w:color="BFC7CC" w:sz="4"/>
+            </w:tcBorders>
+            <w:tcMar>
+              <w:top w:type="dxa" w:w="50"/>
+              <w:left w:type="dxa" w:w="90"/>
+              <w:bottom w:type="dxa" w:w="50"/>
+              <w:right w:type="dxa" w:w="90"/>
+            </w:tcMar>
+          </w:tcPr>
+          <w:p>
+            <w:r>
+              <w:rPr>
+                <w:sz w:val="18"/>
+                <w:szCs w:val="18"/>
+              </w:rPr>
+              <w:t xml:space="preserve">custom ClinicalFeatureAdder, then as numeric</w:t>
+            </w:r>
+          </w:p>
+        </w:tc>
+      </w:tr>
+      <w:tr>
+        <w:tc>
+          <w:tcPr>
+            <w:tcW w:type="dxa" w:w="1400"/>
+            <w:tcBorders>
+              <w:top w:val="single" w:color="BFC7CC" w:sz="4"/>
+              <w:left w:val="single" w:color="BFC7CC" w:sz="4"/>
+              <w:bottom w:val="single" w:color="BFC7CC" w:sz="4"/>
+              <w:right w:val="single" w:color="BFC7CC" w:sz="4"/>
+            </w:tcBorders>
+            <w:tcMar>
+              <w:top w:type="dxa" w:w="50"/>
+              <w:left w:type="dxa" w:w="90"/>
+              <w:bottom w:type="dxa" w:w="50"/>
+              <w:right w:type="dxa" w:w="90"/>
+            </w:tcMar>
+          </w:tcPr>
+          <w:p>
+            <w:r>
+              <w:rPr>
+                <w:sz w:val="18"/>
+                <w:szCs w:val="18"/>
+              </w:rPr>
+              <w:t xml:space="preserve">Binary</w:t>
+            </w:r>
+          </w:p>
+        </w:tc>
+        <w:tc>
+          <w:tcPr>
+            <w:tcW w:type="dxa" w:w="4126"/>
+            <w:tcBorders>
+              <w:top w:val="single" w:color="BFC7CC" w:sz="4"/>
+              <w:left w:val="single" w:color="BFC7CC" w:sz="4"/>
+              <w:bottom w:val="single" w:color="BFC7CC" w:sz="4"/>
+              <w:right w:val="single" w:color="BFC7CC" w:sz="4"/>
+            </w:tcBorders>
+            <w:tcMar>
+              <w:top w:type="dxa" w:w="50"/>
+              <w:left w:type="dxa" w:w="90"/>
+              <w:bottom w:type="dxa" w:w="50"/>
+              <w:right w:type="dxa" w:w="90"/>
+            </w:tcMar>
+          </w:tcPr>
+          <w:p>
+            <w:r>
+              <w:rPr>
+                <w:sz w:val="18"/>
+                <w:szCs w:val="18"/>
+              </w:rPr>
+              <w:t xml:space="preserve">sex, fbs, exang</w:t>
+            </w:r>
+          </w:p>
+        </w:tc>
+        <w:tc>
+          <w:tcPr>
+            <w:tcW w:type="dxa" w:w="3500"/>
+            <w:tcBorders>
+              <w:top w:val="single" w:color="BFC7CC" w:sz="4"/>
+              <w:left w:val="single" w:color="BFC7CC" w:sz="4"/>
+              <w:bottom w:val="single" w:color="BFC7CC" w:sz="4"/>
+              <w:right w:val="single" w:color="BFC7CC" w:sz="4"/>
+            </w:tcBorders>
+            <w:tcMar>
+              <w:top w:type="dxa" w:w="50"/>
+              <w:left w:type="dxa" w:w="90"/>
+              <w:bottom w:type="dxa" w:w="50"/>
+              <w:right w:type="dxa" w:w="90"/>
+            </w:tcMar>
+          </w:tcPr>
+          <w:p>
+            <w:r>
+              <w:rPr>
+                <w:sz w:val="18"/>
+                <w:szCs w:val="18"/>
+              </w:rPr>
+              <w:t xml:space="preserve">most-frequent imputation</w:t>
+            </w:r>
+          </w:p>
+        </w:tc>
+      </w:tr>
+      <w:tr>
+        <w:tc>
+          <w:tcPr>
+            <w:tcW w:type="dxa" w:w="1400"/>
+            <w:tcBorders>
+              <w:top w:val="single" w:color="BFC7CC" w:sz="4"/>
+              <w:left w:val="single" w:color="BFC7CC" w:sz="4"/>
+              <w:bottom w:val="single" w:color="BFC7CC" w:sz="4"/>
+              <w:right w:val="single" w:color="BFC7CC" w:sz="4"/>
+            </w:tcBorders>
+            <w:tcMar>
+              <w:top w:type="dxa" w:w="50"/>
+              <w:left w:type="dxa" w:w="90"/>
+              <w:bottom w:type="dxa" w:w="50"/>
+              <w:right w:type="dxa" w:w="90"/>
+            </w:tcMar>
+          </w:tcPr>
+          <w:p>
+            <w:r>
+              <w:rPr>
+                <w:sz w:val="18"/>
+                <w:szCs w:val="18"/>
+              </w:rPr>
+              <w:t xml:space="preserve">Nominal</w:t>
+            </w:r>
+          </w:p>
+        </w:tc>
+        <w:tc>
+          <w:tcPr>
+            <w:tcW w:type="dxa" w:w="4126"/>
+            <w:tcBorders>
+              <w:top w:val="single" w:color="BFC7CC" w:sz="4"/>
+              <w:left w:val="single" w:color="BFC7CC" w:sz="4"/>
+              <w:bottom w:val="single" w:color="BFC7CC" w:sz="4"/>
+              <w:right w:val="single" w:color="BFC7CC" w:sz="4"/>
+            </w:tcBorders>
+            <w:tcMar>
+              <w:top w:type="dxa" w:w="50"/>
+              <w:left w:type="dxa" w:w="90"/>
+              <w:bottom w:type="dxa" w:w="50"/>
+              <w:right w:type="dxa" w:w="90"/>
+            </w:tcMar>
+          </w:tcPr>
+          <w:p>
+            <w:r>
+              <w:rPr>
+                <w:sz w:val="18"/>
+                <w:szCs w:val="18"/>
+              </w:rPr>
+              <w:t xml:space="preserve">cp, restecg, slope, thal</w:t>
+            </w:r>
+          </w:p>
+        </w:tc>
+        <w:tc>
+          <w:tcPr>
+            <w:tcW w:type="dxa" w:w="3500"/>
+            <w:tcBorders>
+              <w:top w:val="single" w:color="BFC7CC" w:sz="4"/>
+              <w:left w:val="single" w:color="BFC7CC" w:sz="4"/>
+              <w:bottom w:val="single" w:color="BFC7CC" w:sz="4"/>
+              <w:right w:val="single" w:color="BFC7CC" w:sz="4"/>
+            </w:tcBorders>
+            <w:tcMar>
+              <w:top w:type="dxa" w:w="50"/>
+              <w:left w:type="dxa" w:w="90"/>
+              <w:bottom w:type="dxa" w:w="50"/>
+              <w:right w:type="dxa" w:w="90"/>
+            </w:tcMar>
+          </w:tcPr>
+          <w:p>
+            <w:r>
+              <w:rPr>
+                <w:sz w:val="18"/>
+                <w:szCs w:val="18"/>
+              </w:rPr>
+              <w:t xml:space="preserve">most-frequent imputation, one-hot (unknown codes ignored)</w:t>
+            </w:r>
+          </w:p>
+        </w:tc>
+      </w:tr>
+    </w:tbl>
+    <w:p>
+      <w:pPr>
+        <w:spacing w:after="120" w:before="120"/>
+      </w:pPr>
+      <w:r>
+        <w:t xml:space="preserve">The adder, the ColumnTransformer and the estimator form one scikit-learn </w:t>
+      </w:r>
+      <w:r>
+        <w:rPr>
+          <w:rFonts w:ascii="Consolas" w:cs="Consolas" w:eastAsia="Consolas" w:hAnsi="Consolas"/>
+          <w:sz w:val="19"/>
+          <w:szCs w:val="19"/>
+        </w:rPr>
+        <w:t xml:space="preserve">Pipeline</w:t>
+      </w:r>
+      <w:r>
+        <w:t xml:space="preserve">, so raw JSON fields go in and probabilities come out identically in training, the CLI and the API.</w:t>
+      </w:r>
+    </w:p>
+    <w:tbl>
+      <w:tblPr>
+        <w:tblW w:type="dxa" w:w="9026"/>
+        <w:tblBorders>
+          <w:top w:val="single" w:color="auto" w:sz="4"/>
+          <w:left w:val="single" w:color="auto" w:sz="4"/>
+          <w:bottom w:val="single" w:color="auto" w:sz="4"/>
+          <w:right w:val="single" w:color="auto" w:sz="4"/>
+          <w:insideH w:val="single" w:color="auto" w:sz="4"/>
+          <w:insideV w:val="single" w:color="auto" w:sz="4"/>
+        </w:tblBorders>
+      </w:tblPr>
+      <w:tblGrid>
+        <w:gridCol w:w="2300"/>
+        <w:gridCol w:w="3863"/>
+        <w:gridCol w:w="2863"/>
+      </w:tblGrid>
+      <w:tr>
+        <w:trPr>
+          <w:tblHeader/>
+        </w:trPr>
+        <w:tc>
+          <w:tcPr>
+            <w:tcW w:type="dxa" w:w="2300"/>
+            <w:tcBorders>
+              <w:top w:val="single" w:color="BFC7CC" w:sz="4"/>
+              <w:left w:val="single" w:color="BFC7CC" w:sz="4"/>
+              <w:bottom w:val="single" w:color="BFC7CC" w:sz="4"/>
+              <w:right w:val="single" w:color="BFC7CC" w:sz="4"/>
+            </w:tcBorders>
+            <w:shd w:fill="DCE8EC" w:color="auto" w:val="clear"/>
+            <w:tcMar>
+              <w:top w:type="dxa" w:w="50"/>
+              <w:left w:type="dxa" w:w="90"/>
+              <w:bottom w:type="dxa" w:w="50"/>
+              <w:right w:type="dxa" w:w="90"/>
+            </w:tcMar>
+          </w:tcPr>
+          <w:p>
+            <w:r>
+              <w:rPr>
+                <w:b/>
+                <w:bCs/>
+                <w:sz w:val="18"/>
+                <w:szCs w:val="18"/>
+              </w:rPr>
+              <w:t xml:space="preserve">Model</w:t>
+            </w:r>
+          </w:p>
+        </w:tc>
+        <w:tc>
+          <w:tcPr>
+            <w:tcW w:type="dxa" w:w="3863"/>
+            <w:tcBorders>
+              <w:top w:val="single" w:color="BFC7CC" w:sz="4"/>
+              <w:left w:val="single" w:color="BFC7CC" w:sz="4"/>
+              <w:bottom w:val="single" w:color="BFC7CC" w:sz="4"/>
+              <w:right w:val="single" w:color="BFC7CC" w:sz="4"/>
+            </w:tcBorders>
+            <w:shd w:fill="DCE8EC" w:color="auto" w:val="clear"/>
+            <w:tcMar>
+              <w:top w:type="dxa" w:w="50"/>
+              <w:left w:type="dxa" w:w="90"/>
+              <w:bottom w:type="dxa" w:w="50"/>
+              <w:right w:type="dxa" w:w="90"/>
+            </w:tcMar>
+          </w:tcPr>
+          <w:p>
+            <w:r>
+              <w:rPr>
+                <w:b/>
+                <w:bCs/>
+                <w:sz w:val="18"/>
+                <w:szCs w:val="18"/>
+              </w:rPr>
+              <w:t xml:space="preserve">Grid (candidates)</w:t>
+            </w:r>
+          </w:p>
+        </w:tc>
+        <w:tc>
+          <w:tcPr>
+            <w:tcW w:type="dxa" w:w="2863"/>
+            <w:tcBorders>
+              <w:top w:val="single" w:color="BFC7CC" w:sz="4"/>
+              <w:left w:val="single" w:color="BFC7CC" w:sz="4"/>
+              <w:bottom w:val="single" w:color="BFC7CC" w:sz="4"/>
+              <w:right w:val="single" w:color="BFC7CC" w:sz="4"/>
+            </w:tcBorders>
+            <w:shd w:fill="DCE8EC" w:color="auto" w:val="clear"/>
+            <w:tcMar>
+              <w:top w:type="dxa" w:w="50"/>
+              <w:left w:type="dxa" w:w="90"/>
+              <w:bottom w:type="dxa" w:w="50"/>
+              <w:right w:type="dxa" w:w="90"/>
+            </w:tcMar>
+          </w:tcPr>
+          <w:p>
+            <w:r>
+              <w:rPr>
+                <w:b/>
+                <w:bCs/>
+                <w:sz w:val="18"/>
+                <w:szCs w:val="18"/>
+              </w:rPr>
+              <w:t xml:space="preserve">Best parameters</w:t>
+            </w:r>
+          </w:p>
+        </w:tc>
+      </w:tr>
+      <w:tr>
+        <w:tc>
+          <w:tcPr>
+            <w:tcW w:type="dxa" w:w="2300"/>
+            <w:tcBorders>
+              <w:top w:val="single" w:color="BFC7CC" w:sz="4"/>
+              <w:left w:val="single" w:color="BFC7CC" w:sz="4"/>
+              <w:bottom w:val="single" w:color="BFC7CC" w:sz="4"/>
+              <w:right w:val="single" w:color="BFC7CC" w:sz="4"/>
+            </w:tcBorders>
+            <w:tcMar>
+              <w:top w:type="dxa" w:w="50"/>
+              <w:left w:type="dxa" w:w="90"/>
+              <w:bottom w:type="dxa" w:w="50"/>
+              <w:right w:type="dxa" w:w="90"/>
+            </w:tcMar>
+          </w:tcPr>
+          <w:p>
+            <w:r>
+              <w:rPr>
+                <w:sz w:val="18"/>
+                <w:szCs w:val="18"/>
+              </w:rPr>
+              <w:t xml:space="preserve">Logistic Regression (saga)</w:t>
+            </w:r>
+          </w:p>
+        </w:tc>
+        <w:tc>
+          <w:tcPr>
+            <w:tcW w:type="dxa" w:w="3863"/>
+            <w:tcBorders>
+              <w:top w:val="single" w:color="BFC7CC" w:sz="4"/>
+              <w:left w:val="single" w:color="BFC7CC" w:sz="4"/>
+              <w:bottom w:val="single" w:color="BFC7CC" w:sz="4"/>
+              <w:right w:val="single" w:color="BFC7CC" w:sz="4"/>
+            </w:tcBorders>
+            <w:tcMar>
+              <w:top w:type="dxa" w:w="50"/>
+              <w:left w:type="dxa" w:w="90"/>
+              <w:bottom w:type="dxa" w:w="50"/>
+              <w:right w:type="dxa" w:w="90"/>
+            </w:tcMar>
+          </w:tcPr>
+          <w:p>
+            <w:r>
+              <w:rPr>
+                <w:sz w:val="18"/>
+                <w:szCs w:val="18"/>
+              </w:rPr>
+              <w:t xml:space="preserve">C {0.01, 0.1, 1, 10} x l1_ratio {0, 0.5, 1} x class_weight (24)</w:t>
+            </w:r>
+          </w:p>
+        </w:tc>
+        <w:tc>
+          <w:tcPr>
+            <w:tcW w:type="dxa" w:w="2863"/>
+            <w:tcBorders>
+              <w:top w:val="single" w:color="BFC7CC" w:sz="4"/>
+              <w:left w:val="single" w:color="BFC7CC" w:sz="4"/>
+              <w:bottom w:val="single" w:color="BFC7CC" w:sz="4"/>
+              <w:right w:val="single" w:color="BFC7CC" w:sz="4"/>
+            </w:tcBorders>
+            <w:tcMar>
+              <w:top w:type="dxa" w:w="50"/>
+              <w:left w:type="dxa" w:w="90"/>
+              <w:bottom w:type="dxa" w:w="50"/>
+              <w:right w:type="dxa" w:w="90"/>
+            </w:tcMar>
+          </w:tcPr>
+          <w:p>
+            <w:r>
+              <w:rPr>
+                <w:sz w:val="18"/>
+                <w:szCs w:val="18"/>
+              </w:rPr>
+              <w:t xml:space="preserve">C = 1.0, l1_ratio = 0.5 (elastic net), balanced</w:t>
+            </w:r>
+          </w:p>
+        </w:tc>
+      </w:tr>
+      <w:tr>
+        <w:tc>
+          <w:tcPr>
+            <w:tcW w:type="dxa" w:w="2300"/>
+            <w:tcBorders>
+              <w:top w:val="single" w:color="BFC7CC" w:sz="4"/>
+              <w:left w:val="single" w:color="BFC7CC" w:sz="4"/>
+              <w:bottom w:val="single" w:color="BFC7CC" w:sz="4"/>
+              <w:right w:val="single" w:color="BFC7CC" w:sz="4"/>
+            </w:tcBorders>
+            <w:tcMar>
+              <w:top w:type="dxa" w:w="50"/>
+              <w:left w:type="dxa" w:w="90"/>
+              <w:bottom w:type="dxa" w:w="50"/>
+              <w:right w:type="dxa" w:w="90"/>
+            </w:tcMar>
+          </w:tcPr>
+          <w:p>
+            <w:r>
+              <w:rPr>
+                <w:sz w:val="18"/>
+                <w:szCs w:val="18"/>
+              </w:rPr>
+              <w:t xml:space="preserve">Random Forest (300 trees)</w:t>
+            </w:r>
+          </w:p>
+        </w:tc>
+        <w:tc>
+          <w:tcPr>
+            <w:tcW w:type="dxa" w:w="3863"/>
+            <w:tcBorders>
+              <w:top w:val="single" w:color="BFC7CC" w:sz="4"/>
+              <w:left w:val="single" w:color="BFC7CC" w:sz="4"/>
+              <w:bottom w:val="single" w:color="BFC7CC" w:sz="4"/>
+              <w:right w:val="single" w:color="BFC7CC" w:sz="4"/>
+            </w:tcBorders>
+            <w:tcMar>
+              <w:top w:type="dxa" w:w="50"/>
+              <w:left w:type="dxa" w:w="90"/>
+              <w:bottom w:type="dxa" w:w="50"/>
+              <w:right w:type="dxa" w:w="90"/>
+            </w:tcMar>
+          </w:tcPr>
+          <w:p>
+            <w:r>
+              <w:rPr>
+                <w:sz w:val="18"/>
+                <w:szCs w:val="18"/>
+              </w:rPr>
+              <w:t xml:space="preserve">max_depth x min_samples_leaf x max_features x class_weight (24)</w:t>
+            </w:r>
+          </w:p>
+        </w:tc>
+        <w:tc>
+          <w:tcPr>
+            <w:tcW w:type="dxa" w:w="2863"/>
+            <w:tcBorders>
+              <w:top w:val="single" w:color="BFC7CC" w:sz="4"/>
+              <w:left w:val="single" w:color="BFC7CC" w:sz="4"/>
+              <w:bottom w:val="single" w:color="BFC7CC" w:sz="4"/>
+              <w:right w:val="single" w:color="BFC7CC" w:sz="4"/>
+            </w:tcBorders>
+            <w:tcMar>
+              <w:top w:type="dxa" w:w="50"/>
+              <w:left w:type="dxa" w:w="90"/>
+              <w:bottom w:type="dxa" w:w="50"/>
+              <w:right w:type="dxa" w:w="90"/>
+            </w:tcMar>
+          </w:tcPr>
+          <w:p>
+            <w:r>
+              <w:rPr>
+                <w:sz w:val="18"/>
+                <w:szCs w:val="18"/>
+              </w:rPr>
+              <w:t xml:space="preserve">max_depth None, min_samples_leaf 4, max_features 0.5</w:t>
+            </w:r>
+          </w:p>
+        </w:tc>
+      </w:tr>
+      <w:tr>
+        <w:tc>
+          <w:tcPr>
+            <w:tcW w:type="dxa" w:w="2300"/>
+            <w:tcBorders>
+              <w:top w:val="single" w:color="BFC7CC" w:sz="4"/>
+              <w:left w:val="single" w:color="BFC7CC" w:sz="4"/>
+              <w:bottom w:val="single" w:color="BFC7CC" w:sz="4"/>
+              <w:right w:val="single" w:color="BFC7CC" w:sz="4"/>
+            </w:tcBorders>
+            <w:tcMar>
+              <w:top w:type="dxa" w:w="50"/>
+              <w:left w:type="dxa" w:w="90"/>
+              <w:bottom w:type="dxa" w:w="50"/>
+              <w:right w:type="dxa" w:w="90"/>
+            </w:tcMar>
+          </w:tcPr>
+          <w:p>
+            <w:r>
+              <w:rPr>
+                <w:sz w:val="18"/>
+                <w:szCs w:val="18"/>
+              </w:rPr>
+              <w:t xml:space="preserve">Gradient Boosting</w:t>
+            </w:r>
+          </w:p>
+        </w:tc>
+        <w:tc>
+          <w:tcPr>
+            <w:tcW w:type="dxa" w:w="3863"/>
+            <w:tcBorders>
+              <w:top w:val="single" w:color="BFC7CC" w:sz="4"/>
+              <w:left w:val="single" w:color="BFC7CC" w:sz="4"/>
+              <w:bottom w:val="single" w:color="BFC7CC" w:sz="4"/>
+              <w:right w:val="single" w:color="BFC7CC" w:sz="4"/>
+            </w:tcBorders>
+            <w:tcMar>
+              <w:top w:type="dxa" w:w="50"/>
+              <w:left w:type="dxa" w:w="90"/>
+              <w:bottom w:type="dxa" w:w="50"/>
+              <w:right w:type="dxa" w:w="90"/>
+            </w:tcMar>
+          </w:tcPr>
+          <w:p>
+            <w:r>
+              <w:rPr>
+                <w:sz w:val="18"/>
+                <w:szCs w:val="18"/>
+              </w:rPr>
+              <w:t xml:space="preserve">n_estimators x learning_rate x max_depth x subsample (16)</w:t>
+            </w:r>
+          </w:p>
+        </w:tc>
+        <w:tc>
+          <w:tcPr>
+            <w:tcW w:type="dxa" w:w="2863"/>
+            <w:tcBorders>
+              <w:top w:val="single" w:color="BFC7CC" w:sz="4"/>
+              <w:left w:val="single" w:color="BFC7CC" w:sz="4"/>
+              <w:bottom w:val="single" w:color="BFC7CC" w:sz="4"/>
+              <w:right w:val="single" w:color="BFC7CC" w:sz="4"/>
+            </w:tcBorders>
+            <w:tcMar>
+              <w:top w:type="dxa" w:w="50"/>
+              <w:left w:type="dxa" w:w="90"/>
+              <w:bottom w:type="dxa" w:w="50"/>
+              <w:right w:type="dxa" w:w="90"/>
+            </w:tcMar>
+          </w:tcPr>
+          <w:p>
+            <w:r>
+              <w:rPr>
+                <w:sz w:val="18"/>
+                <w:szCs w:val="18"/>
+              </w:rPr>
+              <w:t xml:space="preserve">100 trees, learning_rate 0.03, depth 2, subsample 0.8</w:t>
+            </w:r>
+          </w:p>
+        </w:tc>
+      </w:tr>
+    </w:tbl>
+    <w:p>
+      <w:pPr>
+        <w:spacing w:after="120" w:before="120"/>
+      </w:pPr>
+      <w:r>
+        <w:t xml:space="preserve">Data are split 80/20 with stratification (242 training, 61 test patients). Each candidate is scored by stratified 5-fold cross-validation on accuracy, precision, recall, F1 and ROC-AUC, refitting on ROC-AUC because it is threshold-independent and robust to the mild imbalance. Recall is reported alongside it because a missed diagnosis is costlier than a false alarm. Logistic regression wins on CV ROC-AUC and also shows the smallest train/validation gap (0.932 vs 0.909), whereas the random forest overfits (0.985 vs 0.894).</w:t>
+      </w:r>
+    </w:p>
+    <w:p>
+      <w:pPr>
+        <w:keepNext/>
+        <w:spacing w:after="40" w:before="120"/>
+        <w:jc w:val="center"/>
+      </w:pPr>
+      <w:r>
+        <w:drawing>
+          <wp:inline distT="0" distB="0" distL="0" distR="0">
+            <wp:extent cx="5591175" cy="2762250"/>
+            <wp:effectExtent t="0" r="0" b="0" l="0"/>
+            <wp:docPr id="6" name="model_comparison.png" descr="Cross-validated metrics (mean +/- std) of the best configuration of each model family." title="Cross-validated metrics (mean +/- std) of the best configuration of each model family."/>
+            <wp:cNvGraphicFramePr>
+              <a:graphicFrameLocks xmlns:a="http://schemas.openxmlformats.org/drawingml/2006/main" noChangeAspect="1"/>
+            </wp:cNvGraphicFramePr>
+            <a:graphic xmlns:a="http://schemas.openxmlformats.org/drawingml/2006/main">
+              <a:graphicData uri="http://schemas.openxmlformats.org/drawingml/2006/picture">
+                <pic:pic xmlns:pic="http://schemas.openxmlformats.org/drawingml/2006/picture">
+                  <pic:nvPicPr>
+                    <pic:cNvPr id="0" name="" descr=""/>
+                    <pic:cNvPicPr>
+                      <a:picLocks noChangeAspect="1" noChangeArrowheads="1"/>
+                    </pic:cNvPicPr>
+                  </pic:nvPicPr>
+                  <pic:blipFill>
+                    <a:blip r:embed="rId16" cstate="none"/>
+                    <a:srcRect/>
+                    <a:stretch>
+                      <a:fillRect/>
+                    </a:stretch>
+                  </pic:blipFill>
+                  <pic:spPr bwMode="auto">
+                    <a:xfrm>
+                      <a:off x="0" y="0"/>
                       <a:ext cx="5591175" cy="2762250"/>
                     </a:xfrm>
                     <a:prstGeom prst="rect">
@@ -3059,62 +3113,6 @@
                   <wp:extent cx="2743200" cy="2466975"/>
                   <wp:effectExtent t="0" r="0" b="0" l="0"/>
                   <wp:docPr id="7" name="champion_roc_curve.png" descr="Champion on the hold-out test set: ROC curve (AUC 0.957) and confusion matrix (26 TP, 27 TN, 6 FP, 2 FN)." title="Champion on the hold-out test set: ROC curve (AUC 0.957) and confusion matrix (26 TP, 27 TN, 6 FP, 2 FN)."/>
-                  <wp:cNvGraphicFramePr>
-                    <a:graphicFrameLocks xmlns:a="http://schemas.openxmlformats.org/drawingml/2006/main" noChangeAspect="1"/>
-                  </wp:cNvGraphicFramePr>
-                  <a:graphic xmlns:a="http://schemas.openxmlformats.org/drawingml/2006/main">
-                    <a:graphicData uri="http://schemas.openxmlformats.org/drawingml/2006/picture">
-                      <pic:pic xmlns:pic="http://schemas.openxmlformats.org/drawingml/2006/picture">
-                        <pic:nvPicPr>
-                          <pic:cNvPr id="0" name="" descr=""/>
-                          <pic:cNvPicPr>
-                            <a:picLocks noChangeAspect="1" noChangeArrowheads="1"/>
-                          </pic:cNvPicPr>
-                        </pic:nvPicPr>
-                        <pic:blipFill>
-                          <a:blip r:embed="rId16" cstate="none"/>
-                          <a:srcRect/>
-                          <a:stretch>
-                            <a:fillRect/>
-                          </a:stretch>
-                        </pic:blipFill>
-                        <pic:spPr bwMode="auto">
-                          <a:xfrm>
-                            <a:off x="0" y="0"/>
-                            <a:ext cx="2743200" cy="2466975"/>
-                          </a:xfrm>
-                          <a:prstGeom prst="rect">
-                            <a:avLst/>
-                          </a:prstGeom>
-                        </pic:spPr>
-                      </pic:pic>
-                    </a:graphicData>
-                  </a:graphic>
-                </wp:inline>
-              </w:drawing>
-            </w:r>
-          </w:p>
-        </w:tc>
-        <w:tc>
-          <w:tcPr>
-            <w:tcW w:type="dxa" w:w="4513"/>
-            <w:tcBorders>
-              <w:top w:val="none" w:color="FFFFFF" w:sz="0"/>
-              <w:left w:val="none" w:color="FFFFFF" w:sz="0"/>
-              <w:bottom w:val="none" w:color="FFFFFF" w:sz="0"/>
-              <w:right w:val="none" w:color="FFFFFF" w:sz="0"/>
-            </w:tcBorders>
-          </w:tcPr>
-          <w:p>
-            <w:pPr>
-              <w:jc w:val="center"/>
-            </w:pPr>
-            <w:r>
-              <w:drawing>
-                <wp:inline distT="0" distB="0" distL="0" distR="0">
-                  <wp:extent cx="2743200" cy="2466975"/>
-                  <wp:effectExtent t="0" r="0" b="0" l="0"/>
-                  <wp:docPr id="8" name="champion_confusion_matrix.png" descr="Champion on the hold-out test set: ROC curve (AUC 0.957) and confusion matrix (26 TP, 27 TN, 6 FP, 2 FN)." title="Champion on the hold-out test set: ROC curve (AUC 0.957) and confusion matrix (26 TP, 27 TN, 6 FP, 2 FN)."/>
                   <wp:cNvGraphicFramePr>
                     <a:graphicFrameLocks xmlns:a="http://schemas.openxmlformats.org/drawingml/2006/main" noChangeAspect="1"/>
                   </wp:cNvGraphicFramePr>
@@ -3151,6 +3149,62 @@
             </w:r>
           </w:p>
         </w:tc>
+        <w:tc>
+          <w:tcPr>
+            <w:tcW w:type="dxa" w:w="4513"/>
+            <w:tcBorders>
+              <w:top w:val="none" w:color="FFFFFF" w:sz="0"/>
+              <w:left w:val="none" w:color="FFFFFF" w:sz="0"/>
+              <w:bottom w:val="none" w:color="FFFFFF" w:sz="0"/>
+              <w:right w:val="none" w:color="FFFFFF" w:sz="0"/>
+            </w:tcBorders>
+          </w:tcPr>
+          <w:p>
+            <w:pPr>
+              <w:jc w:val="center"/>
+            </w:pPr>
+            <w:r>
+              <w:drawing>
+                <wp:inline distT="0" distB="0" distL="0" distR="0">
+                  <wp:extent cx="2743200" cy="2466975"/>
+                  <wp:effectExtent t="0" r="0" b="0" l="0"/>
+                  <wp:docPr id="8" name="champion_confusion_matrix.png" descr="Champion on the hold-out test set: ROC curve (AUC 0.957) and confusion matrix (26 TP, 27 TN, 6 FP, 2 FN)." title="Champion on the hold-out test set: ROC curve (AUC 0.957) and confusion matrix (26 TP, 27 TN, 6 FP, 2 FN)."/>
+                  <wp:cNvGraphicFramePr>
+                    <a:graphicFrameLocks xmlns:a="http://schemas.openxmlformats.org/drawingml/2006/main" noChangeAspect="1"/>
+                  </wp:cNvGraphicFramePr>
+                  <a:graphic xmlns:a="http://schemas.openxmlformats.org/drawingml/2006/main">
+                    <a:graphicData uri="http://schemas.openxmlformats.org/drawingml/2006/picture">
+                      <pic:pic xmlns:pic="http://schemas.openxmlformats.org/drawingml/2006/picture">
+                        <pic:nvPicPr>
+                          <pic:cNvPr id="0" name="" descr=""/>
+                          <pic:cNvPicPr>
+                            <a:picLocks noChangeAspect="1" noChangeArrowheads="1"/>
+                          </pic:cNvPicPr>
+                        </pic:nvPicPr>
+                        <pic:blipFill>
+                          <a:blip r:embed="rId18" cstate="none"/>
+                          <a:srcRect/>
+                          <a:stretch>
+                            <a:fillRect/>
+                          </a:stretch>
+                        </pic:blipFill>
+                        <pic:spPr bwMode="auto">
+                          <a:xfrm>
+                            <a:off x="0" y="0"/>
+                            <a:ext cx="2743200" cy="2466975"/>
+                          </a:xfrm>
+                          <a:prstGeom prst="rect">
+                            <a:avLst/>
+                          </a:prstGeom>
+                        </pic:spPr>
+                      </pic:pic>
+                    </a:graphicData>
+                  </a:graphic>
+                </wp:inline>
+              </w:drawing>
+            </w:r>
+          </w:p>
+        </w:tc>
       </w:tr>
     </w:tbl>
     <w:p>
@@ -3316,7 +3370,7 @@
                     </pic:cNvPicPr>
                   </pic:nvPicPr>
                   <pic:blipFill>
-                    <a:blip r:embed="rId18" cstate="none"/>
+                    <a:blip r:embed="rId19" cstate="none"/>
                     <a:srcRect/>
                     <a:stretch>
                       <a:fillRect/>
@@ -3401,62 +3455,6 @@
                   <wp:extent cx="2743200" cy="1714500"/>
                   <wp:effectExtent t="0" r="0" b="0" l="0"/>
                   <wp:docPr id="10" name="mlflow_07_tuning_parallel_coordinates.png" descr="Tuning trace of the 24 logistic-regression candidates, and the registered model with the champion alias." title="Tuning trace of the 24 logistic-regression candidates, and the registered model with the champion alias."/>
-                  <wp:cNvGraphicFramePr>
-                    <a:graphicFrameLocks xmlns:a="http://schemas.openxmlformats.org/drawingml/2006/main" noChangeAspect="1"/>
-                  </wp:cNvGraphicFramePr>
-                  <a:graphic xmlns:a="http://schemas.openxmlformats.org/drawingml/2006/main">
-                    <a:graphicData uri="http://schemas.openxmlformats.org/drawingml/2006/picture">
-                      <pic:pic xmlns:pic="http://schemas.openxmlformats.org/drawingml/2006/picture">
-                        <pic:nvPicPr>
-                          <pic:cNvPr id="0" name="" descr=""/>
-                          <pic:cNvPicPr>
-                            <a:picLocks noChangeAspect="1" noChangeArrowheads="1"/>
-                          </pic:cNvPicPr>
-                        </pic:nvPicPr>
-                        <pic:blipFill>
-                          <a:blip r:embed="rId19" cstate="none"/>
-                          <a:srcRect/>
-                          <a:stretch>
-                            <a:fillRect/>
-                          </a:stretch>
-                        </pic:blipFill>
-                        <pic:spPr bwMode="auto">
-                          <a:xfrm>
-                            <a:off x="0" y="0"/>
-                            <a:ext cx="2743200" cy="1714500"/>
-                          </a:xfrm>
-                          <a:prstGeom prst="rect">
-                            <a:avLst/>
-                          </a:prstGeom>
-                        </pic:spPr>
-                      </pic:pic>
-                    </a:graphicData>
-                  </a:graphic>
-                </wp:inline>
-              </w:drawing>
-            </w:r>
-          </w:p>
-        </w:tc>
-        <w:tc>
-          <w:tcPr>
-            <w:tcW w:type="dxa" w:w="4513"/>
-            <w:tcBorders>
-              <w:top w:val="none" w:color="FFFFFF" w:sz="0"/>
-              <w:left w:val="none" w:color="FFFFFF" w:sz="0"/>
-              <w:bottom w:val="none" w:color="FFFFFF" w:sz="0"/>
-              <w:right w:val="none" w:color="FFFFFF" w:sz="0"/>
-            </w:tcBorders>
-          </w:tcPr>
-          <w:p>
-            <w:pPr>
-              <w:jc w:val="center"/>
-            </w:pPr>
-            <w:r>
-              <w:drawing>
-                <wp:inline distT="0" distB="0" distL="0" distR="0">
-                  <wp:extent cx="2743200" cy="1714500"/>
-                  <wp:effectExtent t="0" r="0" b="0" l="0"/>
-                  <wp:docPr id="11" name="mlflow_10_registered_model.png" descr="Tuning trace of the 24 logistic-regression candidates, and the registered model with the champion alias." title="Tuning trace of the 24 logistic-regression candidates, and the registered model with the champion alias."/>
                   <wp:cNvGraphicFramePr>
                     <a:graphicFrameLocks xmlns:a="http://schemas.openxmlformats.org/drawingml/2006/main" noChangeAspect="1"/>
                   </wp:cNvGraphicFramePr>
@@ -3493,6 +3491,62 @@
             </w:r>
           </w:p>
         </w:tc>
+        <w:tc>
+          <w:tcPr>
+            <w:tcW w:type="dxa" w:w="4513"/>
+            <w:tcBorders>
+              <w:top w:val="none" w:color="FFFFFF" w:sz="0"/>
+              <w:left w:val="none" w:color="FFFFFF" w:sz="0"/>
+              <w:bottom w:val="none" w:color="FFFFFF" w:sz="0"/>
+              <w:right w:val="none" w:color="FFFFFF" w:sz="0"/>
+            </w:tcBorders>
+          </w:tcPr>
+          <w:p>
+            <w:pPr>
+              <w:jc w:val="center"/>
+            </w:pPr>
+            <w:r>
+              <w:drawing>
+                <wp:inline distT="0" distB="0" distL="0" distR="0">
+                  <wp:extent cx="2743200" cy="1714500"/>
+                  <wp:effectExtent t="0" r="0" b="0" l="0"/>
+                  <wp:docPr id="11" name="mlflow_10_registered_model.png" descr="Tuning trace of the 24 logistic-regression candidates, and the registered model with the champion alias." title="Tuning trace of the 24 logistic-regression candidates, and the registered model with the champion alias."/>
+                  <wp:cNvGraphicFramePr>
+                    <a:graphicFrameLocks xmlns:a="http://schemas.openxmlformats.org/drawingml/2006/main" noChangeAspect="1"/>
+                  </wp:cNvGraphicFramePr>
+                  <a:graphic xmlns:a="http://schemas.openxmlformats.org/drawingml/2006/main">
+                    <a:graphicData uri="http://schemas.openxmlformats.org/drawingml/2006/picture">
+                      <pic:pic xmlns:pic="http://schemas.openxmlformats.org/drawingml/2006/picture">
+                        <pic:nvPicPr>
+                          <pic:cNvPr id="0" name="" descr=""/>
+                          <pic:cNvPicPr>
+                            <a:picLocks noChangeAspect="1" noChangeArrowheads="1"/>
+                          </pic:cNvPicPr>
+                        </pic:nvPicPr>
+                        <pic:blipFill>
+                          <a:blip r:embed="rId21" cstate="none"/>
+                          <a:srcRect/>
+                          <a:stretch>
+                            <a:fillRect/>
+                          </a:stretch>
+                        </pic:blipFill>
+                        <pic:spPr bwMode="auto">
+                          <a:xfrm>
+                            <a:off x="0" y="0"/>
+                            <a:ext cx="2743200" cy="1714500"/>
+                          </a:xfrm>
+                          <a:prstGeom prst="rect">
+                            <a:avLst/>
+                          </a:prstGeom>
+                        </pic:spPr>
+                      </pic:pic>
+                    </a:graphicData>
+                  </a:graphic>
+                </wp:inline>
+              </w:drawing>
+            </w:r>
+          </w:p>
+        </w:tc>
       </w:tr>
     </w:tbl>
     <w:p>
@@ -4173,205 +4227,6 @@
             <wp:extent cx="3981450" cy="3238500"/>
             <wp:effectExtent t="0" r="0" b="0" l="0"/>
             <wp:docPr id="12" name="github_02_pipeline_run.png" descr="Successful pipeline run: four jobs, annotations and uploaded artifacts." title="Successful pipeline run: four jobs, annotations and uploaded artifacts."/>
-            <wp:cNvGraphicFramePr>
-              <a:graphicFrameLocks xmlns:a="http://schemas.openxmlformats.org/drawingml/2006/main" noChangeAspect="1"/>
-            </wp:cNvGraphicFramePr>
-            <a:graphic xmlns:a="http://schemas.openxmlformats.org/drawingml/2006/main">
-              <a:graphicData uri="http://schemas.openxmlformats.org/drawingml/2006/picture">
-                <pic:pic xmlns:pic="http://schemas.openxmlformats.org/drawingml/2006/picture">
-                  <pic:nvPicPr>
-                    <pic:cNvPr id="0" name="" descr=""/>
-                    <pic:cNvPicPr>
-                      <a:picLocks noChangeAspect="1" noChangeArrowheads="1"/>
-                    </pic:cNvPicPr>
-                  </pic:nvPicPr>
-                  <pic:blipFill>
-                    <a:blip r:embed="rId21" cstate="none"/>
-                    <a:srcRect/>
-                    <a:stretch>
-                      <a:fillRect/>
-                    </a:stretch>
-                  </pic:blipFill>
-                  <pic:spPr bwMode="auto">
-                    <a:xfrm>
-                      <a:off x="0" y="0"/>
-                      <a:ext cx="3981450" cy="3238500"/>
-                    </a:xfrm>
-                    <a:prstGeom prst="rect">
-                      <a:avLst/>
-                    </a:prstGeom>
-                  </pic:spPr>
-                </pic:pic>
-              </a:graphicData>
-            </a:graphic>
-          </wp:inline>
-        </w:drawing>
-      </w:r>
-    </w:p>
-    <w:p>
-      <w:pPr>
-        <w:spacing w:after="200"/>
-        <w:jc w:val="center"/>
-      </w:pPr>
-      <w:r>
-        <w:rPr>
-          <w:b/>
-          <w:bCs/>
-          <w:color w:val="555555"/>
-          <w:sz w:val="18"/>
-          <w:szCs w:val="18"/>
-        </w:rPr>
-        <w:t xml:space="preserve">Figure 9. </w:t>
-      </w:r>
-      <w:r>
-        <w:rPr>
-          <w:i/>
-          <w:iCs/>
-          <w:color w:val="555555"/>
-          <w:sz w:val="18"/>
-          <w:szCs w:val="18"/>
-        </w:rPr>
-        <w:t xml:space="preserve">Successful pipeline run: four jobs, annotations and uploaded artifacts.</w:t>
-      </w:r>
-    </w:p>
-    <w:p>
-      <w:pPr>
-        <w:pStyle w:val="Heading1"/>
-      </w:pPr>
-      <w:r>
-        <w:t xml:space="preserve">9. Model containerisation</w:t>
-      </w:r>
-    </w:p>
-    <w:p>
-      <w:pPr>
-        <w:spacing w:after="120" w:line="276"/>
-      </w:pPr>
-      <w:r>
-        <w:t xml:space="preserve">The serving image (</w:t>
-      </w:r>
-      <w:r>
-        <w:rPr>
-          <w:rFonts w:ascii="Consolas" w:cs="Consolas" w:eastAsia="Consolas" w:hAnsi="Consolas"/>
-          <w:sz w:val="19"/>
-          <w:szCs w:val="19"/>
-        </w:rPr>
-        <w:t xml:space="preserve">python:3.12-slim</w:t>
-      </w:r>
-      <w:r>
-        <w:t xml:space="preserve">) installs only the runtime dependencies, copies the package, API and model, and runs as an unprivileged user (uid 10001) with a Docker HEALTHCHECK. The FastAPI service exposes </w:t>
-      </w:r>
-      <w:r>
-        <w:rPr>
-          <w:rFonts w:ascii="Consolas" w:cs="Consolas" w:eastAsia="Consolas" w:hAnsi="Consolas"/>
-          <w:sz w:val="19"/>
-          <w:szCs w:val="19"/>
-        </w:rPr>
-        <w:t xml:space="preserve">POST /predict</w:t>
-      </w:r>
-      <w:r>
-        <w:t xml:space="preserve"> (one patient), </w:t>
-      </w:r>
-      <w:r>
-        <w:rPr>
-          <w:rFonts w:ascii="Consolas" w:cs="Consolas" w:eastAsia="Consolas" w:hAnsi="Consolas"/>
-          <w:sz w:val="19"/>
-          <w:szCs w:val="19"/>
-        </w:rPr>
-        <w:t xml:space="preserve">POST /predict/batch</w:t>
-      </w:r>
-      <w:r>
-        <w:t xml:space="preserve"> (up to 100), </w:t>
-      </w:r>
-      <w:r>
-        <w:rPr>
-          <w:rFonts w:ascii="Consolas" w:cs="Consolas" w:eastAsia="Consolas" w:hAnsi="Consolas"/>
-          <w:sz w:val="19"/>
-          <w:szCs w:val="19"/>
-        </w:rPr>
-        <w:t xml:space="preserve">/health</w:t>
-      </w:r>
-      <w:r>
-        <w:t xml:space="preserve"> (liveness), </w:t>
-      </w:r>
-      <w:r>
-        <w:rPr>
-          <w:rFonts w:ascii="Consolas" w:cs="Consolas" w:eastAsia="Consolas" w:hAnsi="Consolas"/>
-          <w:sz w:val="19"/>
-          <w:szCs w:val="19"/>
-        </w:rPr>
-        <w:t xml:space="preserve">/ready</w:t>
-      </w:r>
-      <w:r>
-        <w:t xml:space="preserve"> (readiness, 503 without a model), </w:t>
-      </w:r>
-      <w:r>
-        <w:rPr>
-          <w:rFonts w:ascii="Consolas" w:cs="Consolas" w:eastAsia="Consolas" w:hAnsi="Consolas"/>
-          <w:sz w:val="19"/>
-          <w:szCs w:val="19"/>
-        </w:rPr>
-        <w:t xml:space="preserve">/model-info</w:t>
-      </w:r>
-      <w:r>
-        <w:t xml:space="preserve">, </w:t>
-      </w:r>
-      <w:r>
-        <w:rPr>
-          <w:rFonts w:ascii="Consolas" w:cs="Consolas" w:eastAsia="Consolas" w:hAnsi="Consolas"/>
-          <w:sz w:val="19"/>
-          <w:szCs w:val="19"/>
-        </w:rPr>
-        <w:t xml:space="preserve">/metrics</w:t>
-      </w:r>
-      <w:r>
-        <w:t xml:space="preserve"> and interactive </w:t>
-      </w:r>
-      <w:r>
-        <w:rPr>
-          <w:rFonts w:ascii="Consolas" w:cs="Consolas" w:eastAsia="Consolas" w:hAnsi="Consolas"/>
-          <w:sz w:val="19"/>
-          <w:szCs w:val="19"/>
-        </w:rPr>
-        <w:t xml:space="preserve">/docs</w:t>
-      </w:r>
-      <w:r>
-        <w:t xml:space="preserve">. Input validation reuses the data-cleaning plausibility rules, rejects unknown fields and accepts </w:t>
-      </w:r>
-      <w:r>
-        <w:rPr>
-          <w:rFonts w:ascii="Consolas" w:cs="Consolas" w:eastAsia="Consolas" w:hAnsi="Consolas"/>
-          <w:sz w:val="19"/>
-          <w:szCs w:val="19"/>
-        </w:rPr>
-        <w:t xml:space="preserve">ca</w:t>
-      </w:r>
-      <w:r>
-        <w:t xml:space="preserve">/</w:t>
-      </w:r>
-      <w:r>
-        <w:rPr>
-          <w:rFonts w:ascii="Consolas" w:cs="Consolas" w:eastAsia="Consolas" w:hAnsi="Consolas"/>
-          <w:sz w:val="19"/>
-          <w:szCs w:val="19"/>
-        </w:rPr>
-        <w:t xml:space="preserve">thal</w:t>
-      </w:r>
-      <w:r>
-        <w:t xml:space="preserve"> as optional. Each response returns the prediction, label, disease probability, confidence (probability of the predicted class), risk band, model version and request ID. One worker runs per container so in-process Prometheus metrics stay correct, and the service scales through replicas.</w:t>
-      </w:r>
-    </w:p>
-    <w:p>
-      <w:pPr>
-        <w:keepNext/>
-        <w:spacing w:after="40" w:before="120"/>
-        <w:jc w:val="center"/>
-      </w:pPr>
-      <w:r>
-        <w:drawing>
-          <wp:inline distT="0" distB="0" distL="0" distR="0">
-            <wp:extent cx="5715000" cy="3114675"/>
-            <wp:effectExtent t="0" r="0" b="0" l="0"/>
-            <wp:docPr id="13" name="docker_02_run_and_smoke_test.png" descr="Container run and smoke test (real terminal output): healthy, non-root, JSON logs." title="Container run and smoke test (real terminal output): healthy, non-root, JSON logs."/>
             <wp:cNvGraphicFramePr>
               <a:graphicFrameLocks xmlns:a="http://schemas.openxmlformats.org/drawingml/2006/main" noChangeAspect="1"/>
             </wp:cNvGraphicFramePr>
@@ -4394,7 +4249,7 @@
                   <pic:spPr bwMode="auto">
                     <a:xfrm>
                       <a:off x="0" y="0"/>
-                      <a:ext cx="5715000" cy="3114675"/>
+                      <a:ext cx="3981450" cy="3238500"/>
                     </a:xfrm>
                     <a:prstGeom prst="rect">
                       <a:avLst/>
@@ -4420,7 +4275,7 @@
           <w:sz w:val="18"/>
           <w:szCs w:val="18"/>
         </w:rPr>
-        <w:t xml:space="preserve">Figure 10. </w:t>
+        <w:t xml:space="preserve">Figure 9. </w:t>
       </w:r>
       <w:r>
         <w:rPr>
@@ -4430,7 +4285,7 @@
           <w:sz w:val="18"/>
           <w:szCs w:val="18"/>
         </w:rPr>
-        <w:t xml:space="preserve">Container run and smoke test (real terminal output): healthy, non-root, JSON logs.</w:t>
+        <w:t xml:space="preserve">Successful pipeline run: four jobs, annotations and uploaded artifacts.</w:t>
       </w:r>
     </w:p>
     <w:p>
@@ -4438,7 +4293,7 @@
         <w:pStyle w:val="Heading1"/>
       </w:pPr>
       <w:r>
-        <w:t xml:space="preserve">10. Production deployment on Kubernetes</w:t>
+        <w:t xml:space="preserve">9. Model containerisation</w:t>
       </w:r>
     </w:p>
     <w:p>
@@ -4446,7 +4301,7 @@
         <w:spacing w:after="120" w:line="276"/>
       </w:pPr>
       <w:r>
-        <w:t xml:space="preserve">The manifests in </w:t>
+        <w:t xml:space="preserve">The serving image (</w:t>
       </w:r>
       <w:r>
         <w:rPr>
@@ -4454,10 +4309,10 @@
           <w:sz w:val="19"/>
           <w:szCs w:val="19"/>
         </w:rPr>
-        <w:t xml:space="preserve">k8s/</w:t>
-      </w:r>
-      <w:r>
-        <w:t xml:space="preserve"> (applied with </w:t>
+        <w:t xml:space="preserve">python:3.12-slim</w:t>
+      </w:r>
+      <w:r>
+        <w:t xml:space="preserve">) installs only the runtime dependencies, copies the package, API and model, and runs as an unprivileged user (uid 10001) with a Docker HEALTHCHECK. The FastAPI service exposes </w:t>
       </w:r>
       <w:r>
         <w:rPr>
@@ -4465,10 +4320,10 @@
           <w:sz w:val="19"/>
           <w:szCs w:val="19"/>
         </w:rPr>
-        <w:t xml:space="preserve">kubectl apply -k k8s/</w:t>
-      </w:r>
-      <w:r>
-        <w:t xml:space="preserve"> or </w:t>
+        <w:t xml:space="preserve">POST /predict</w:t>
+      </w:r>
+      <w:r>
+        <w:t xml:space="preserve"> (one patient), </w:t>
       </w:r>
       <w:r>
         <w:rPr>
@@ -4476,10 +4331,87 @@
           <w:sz w:val="19"/>
           <w:szCs w:val="19"/>
         </w:rPr>
-        <w:t xml:space="preserve">scripts/k8s_deploy.sh</w:t>
-      </w:r>
-      <w:r>
-        <w:t xml:space="preserve">) create a namespace that enforces the restricted Pod Security Standard, a ConfigMap, and a two-replica Deployment of the published image with zero-downtime rolling updates (maxUnavailable 0), startup, readiness and liveness probes, CPU and memory requests and limits, a read-only root filesystem with all capabilities dropped, and a PodDisruptionBudget. A LoadBalancer service exposes port 8000 (published on localhost by Docker Desktop; an external IP on AKS, EKS or GKE) and a headless service gives Prometheus every pod address. The deployment was verified on Docker Desktop Kubernetes v1.34.</w:t>
+        <w:t xml:space="preserve">POST /predict/batch</w:t>
+      </w:r>
+      <w:r>
+        <w:t xml:space="preserve"> (up to 100), </w:t>
+      </w:r>
+      <w:r>
+        <w:rPr>
+          <w:rFonts w:ascii="Consolas" w:cs="Consolas" w:eastAsia="Consolas" w:hAnsi="Consolas"/>
+          <w:sz w:val="19"/>
+          <w:szCs w:val="19"/>
+        </w:rPr>
+        <w:t xml:space="preserve">/health</w:t>
+      </w:r>
+      <w:r>
+        <w:t xml:space="preserve"> (liveness), </w:t>
+      </w:r>
+      <w:r>
+        <w:rPr>
+          <w:rFonts w:ascii="Consolas" w:cs="Consolas" w:eastAsia="Consolas" w:hAnsi="Consolas"/>
+          <w:sz w:val="19"/>
+          <w:szCs w:val="19"/>
+        </w:rPr>
+        <w:t xml:space="preserve">/ready</w:t>
+      </w:r>
+      <w:r>
+        <w:t xml:space="preserve"> (readiness, 503 without a model), </w:t>
+      </w:r>
+      <w:r>
+        <w:rPr>
+          <w:rFonts w:ascii="Consolas" w:cs="Consolas" w:eastAsia="Consolas" w:hAnsi="Consolas"/>
+          <w:sz w:val="19"/>
+          <w:szCs w:val="19"/>
+        </w:rPr>
+        <w:t xml:space="preserve">/model-info</w:t>
+      </w:r>
+      <w:r>
+        <w:t xml:space="preserve">, </w:t>
+      </w:r>
+      <w:r>
+        <w:rPr>
+          <w:rFonts w:ascii="Consolas" w:cs="Consolas" w:eastAsia="Consolas" w:hAnsi="Consolas"/>
+          <w:sz w:val="19"/>
+          <w:szCs w:val="19"/>
+        </w:rPr>
+        <w:t xml:space="preserve">/metrics</w:t>
+      </w:r>
+      <w:r>
+        <w:t xml:space="preserve"> and interactive </w:t>
+      </w:r>
+      <w:r>
+        <w:rPr>
+          <w:rFonts w:ascii="Consolas" w:cs="Consolas" w:eastAsia="Consolas" w:hAnsi="Consolas"/>
+          <w:sz w:val="19"/>
+          <w:szCs w:val="19"/>
+        </w:rPr>
+        <w:t xml:space="preserve">/docs</w:t>
+      </w:r>
+      <w:r>
+        <w:t xml:space="preserve">. Input validation reuses the data-cleaning plausibility rules, rejects unknown fields and accepts </w:t>
+      </w:r>
+      <w:r>
+        <w:rPr>
+          <w:rFonts w:ascii="Consolas" w:cs="Consolas" w:eastAsia="Consolas" w:hAnsi="Consolas"/>
+          <w:sz w:val="19"/>
+          <w:szCs w:val="19"/>
+        </w:rPr>
+        <w:t xml:space="preserve">ca</w:t>
+      </w:r>
+      <w:r>
+        <w:t xml:space="preserve">/</w:t>
+      </w:r>
+      <w:r>
+        <w:rPr>
+          <w:rFonts w:ascii="Consolas" w:cs="Consolas" w:eastAsia="Consolas" w:hAnsi="Consolas"/>
+          <w:sz w:val="19"/>
+          <w:szCs w:val="19"/>
+        </w:rPr>
+        <w:t xml:space="preserve">thal</w:t>
+      </w:r>
+      <w:r>
+        <w:t xml:space="preserve"> as optional. Each response returns the prediction, label, disease probability, confidence (probability of the predicted class), risk band, model version and request ID. One worker runs per container so in-process Prometheus metrics stay correct, and the service scales through replicas.</w:t>
       </w:r>
     </w:p>
     <w:p>
@@ -4491,9 +4423,9 @@
       <w:r>
         <w:drawing>
           <wp:inline distT="0" distB="0" distL="0" distR="0">
-            <wp:extent cx="5715000" cy="2600325"/>
+            <wp:extent cx="5715000" cy="3114675"/>
             <wp:effectExtent t="0" r="0" b="0" l="0"/>
-            <wp:docPr id="14" name="k8s_01_cluster_and_workloads.png" descr="Cluster, Deployment (2/2 ready), pods, PodDisruptionBudget and services, including the LoadBalancer." title="Cluster, Deployment (2/2 ready), pods, PodDisruptionBudget and services, including the LoadBalancer."/>
+            <wp:docPr id="13" name="docker_02_run_and_smoke_test.png" descr="Container run and smoke test (real terminal output): healthy, non-root, JSON logs." title="Container run and smoke test (real terminal output): healthy, non-root, JSON logs."/>
             <wp:cNvGraphicFramePr>
               <a:graphicFrameLocks xmlns:a="http://schemas.openxmlformats.org/drawingml/2006/main" noChangeAspect="1"/>
             </wp:cNvGraphicFramePr>
@@ -4516,7 +4448,7 @@
                   <pic:spPr bwMode="auto">
                     <a:xfrm>
                       <a:off x="0" y="0"/>
-                      <a:ext cx="5715000" cy="2600325"/>
+                      <a:ext cx="5715000" cy="3114675"/>
                     </a:xfrm>
                     <a:prstGeom prst="rect">
                       <a:avLst/>
@@ -4542,7 +4474,7 @@
           <w:sz w:val="18"/>
           <w:szCs w:val="18"/>
         </w:rPr>
-        <w:t xml:space="preserve">Figure 11. </w:t>
+        <w:t xml:space="preserve">Figure 10. </w:t>
       </w:r>
       <w:r>
         <w:rPr>
@@ -4552,7 +4484,56 @@
           <w:sz w:val="18"/>
           <w:szCs w:val="18"/>
         </w:rPr>
-        <w:t xml:space="preserve">Cluster, Deployment (2/2 ready), pods, PodDisruptionBudget and services, including the LoadBalancer.</w:t>
+        <w:t xml:space="preserve">Container run and smoke test (real terminal output): healthy, non-root, JSON logs.</w:t>
+      </w:r>
+    </w:p>
+    <w:p>
+      <w:pPr>
+        <w:pStyle w:val="Heading1"/>
+      </w:pPr>
+      <w:r>
+        <w:t xml:space="preserve">10. Production deployment on Kubernetes</w:t>
+      </w:r>
+    </w:p>
+    <w:p>
+      <w:pPr>
+        <w:spacing w:after="120" w:line="276"/>
+      </w:pPr>
+      <w:r>
+        <w:t xml:space="preserve">The manifests in </w:t>
+      </w:r>
+      <w:r>
+        <w:rPr>
+          <w:rFonts w:ascii="Consolas" w:cs="Consolas" w:eastAsia="Consolas" w:hAnsi="Consolas"/>
+          <w:sz w:val="19"/>
+          <w:szCs w:val="19"/>
+        </w:rPr>
+        <w:t xml:space="preserve">k8s/</w:t>
+      </w:r>
+      <w:r>
+        <w:t xml:space="preserve"> (applied with </w:t>
+      </w:r>
+      <w:r>
+        <w:rPr>
+          <w:rFonts w:ascii="Consolas" w:cs="Consolas" w:eastAsia="Consolas" w:hAnsi="Consolas"/>
+          <w:sz w:val="19"/>
+          <w:szCs w:val="19"/>
+        </w:rPr>
+        <w:t xml:space="preserve">kubectl apply -k k8s/</w:t>
+      </w:r>
+      <w:r>
+        <w:t xml:space="preserve"> or </w:t>
+      </w:r>
+      <w:r>
+        <w:rPr>
+          <w:rFonts w:ascii="Consolas" w:cs="Consolas" w:eastAsia="Consolas" w:hAnsi="Consolas"/>
+          <w:sz w:val="19"/>
+          <w:szCs w:val="19"/>
+        </w:rPr>
+        <w:t xml:space="preserve">scripts/k8s_deploy.sh</w:t>
+      </w:r>
+      <w:r>
+        <w:t xml:space="preserve">) create a namespace that enforces the restricted Pod Security Standard, a ConfigMap, and a two-replica Deployment of the published image with zero-downtime rolling updates (maxUnavailable 0), startup, readiness and liveness probes, CPU and memory requests and limits, a read-only root filesystem with all capabilities dropped, and a PodDisruptionBudget. A LoadBalancer service exposes port 8000 (published on localhost by Docker Desktop; an external IP on AKS, EKS or GKE) and a headless service gives Prometheus every pod address. The deployment was verified on Docker Desktop Kubernetes v1.34.</w:t>
       </w:r>
     </w:p>
     <w:p>
@@ -4564,9 +4545,9 @@
       <w:r>
         <w:drawing>
           <wp:inline distT="0" distB="0" distL="0" distR="0">
-            <wp:extent cx="5715000" cy="2009775"/>
+            <wp:extent cx="5715000" cy="2600325"/>
             <wp:effectExtent t="0" r="0" b="0" l="0"/>
-            <wp:docPr id="15" name="k8s_03_loadbalancer_requests.png" descr="Endpoint verification through the LoadBalancer, including a rejected invalid request and pod logs." title="Endpoint verification through the LoadBalancer, including a rejected invalid request and pod logs."/>
+            <wp:docPr id="14" name="k8s_01_cluster_and_workloads.png" descr="Cluster, Deployment (2/2 ready), pods, PodDisruptionBudget and services, including the LoadBalancer." title="Cluster, Deployment (2/2 ready), pods, PodDisruptionBudget and services, including the LoadBalancer."/>
             <wp:cNvGraphicFramePr>
               <a:graphicFrameLocks xmlns:a="http://schemas.openxmlformats.org/drawingml/2006/main" noChangeAspect="1"/>
             </wp:cNvGraphicFramePr>
@@ -4589,7 +4570,7 @@
                   <pic:spPr bwMode="auto">
                     <a:xfrm>
                       <a:off x="0" y="0"/>
-                      <a:ext cx="5715000" cy="2009775"/>
+                      <a:ext cx="5715000" cy="2600325"/>
                     </a:xfrm>
                     <a:prstGeom prst="rect">
                       <a:avLst/>
@@ -4615,7 +4596,7 @@
           <w:sz w:val="18"/>
           <w:szCs w:val="18"/>
         </w:rPr>
-        <w:t xml:space="preserve">Figure 12. </w:t>
+        <w:t xml:space="preserve">Figure 11. </w:t>
       </w:r>
       <w:r>
         <w:rPr>
@@ -4625,60 +4606,7 @@
           <w:sz w:val="18"/>
           <w:szCs w:val="18"/>
         </w:rPr>
-        <w:t xml:space="preserve">Endpoint verification through the LoadBalancer, including a rejected invalid request and pod logs.</w:t>
-      </w:r>
-    </w:p>
-    <w:p>
-      <w:pPr>
-        <w:pStyle w:val="Heading1"/>
-      </w:pPr>
-      <w:r>
-        <w:t xml:space="preserve">11. Monitoring and logging</w:t>
-      </w:r>
-    </w:p>
-    <w:p>
-      <w:pPr>
-        <w:spacing w:after="120" w:line="276"/>
-      </w:pPr>
-      <w:r>
-        <w:rPr>
-          <w:b/>
-          <w:bCs/>
-        </w:rPr>
-        <w:t xml:space="preserve">Logging:</w:t>
-      </w:r>
-      <w:r>
-        <w:t xml:space="preserve"> every request produces one JSON line (timestamp, request ID, method, path, status, latency, client) and every prediction one line with label, probability and risk band. Raw clinical inputs are never logged, because they are health data. </w:t>
-      </w:r>
-      <w:r>
-        <w:rPr>
-          <w:b/>
-          <w:bCs/>
-        </w:rPr>
-        <w:t xml:space="preserve">Metrics:</w:t>
-      </w:r>
-      <w:r>
-        <w:t xml:space="preserve"> request count and latency histograms per route template, in-flight requests, predictions per label and risk band, a histogram of predicted probabilities, inference time and model-loaded/model-info gauges. </w:t>
-      </w:r>
-      <w:r>
-        <w:rPr>
-          <w:b/>
-          <w:bCs/>
-        </w:rPr>
-        <w:t xml:space="preserve">Prometheus</w:t>
-      </w:r>
-      <w:r>
-        <w:t xml:space="preserve"> scrapes each replica every 10 seconds and evaluates five alert rules: replica down, model not loaded, 5xx ratio above 5 %, p95 /predict latency above 500 ms, and prediction drift (positive share far from the 46 % training prevalence). </w:t>
-      </w:r>
-      <w:r>
-        <w:rPr>
-          <w:b/>
-          <w:bCs/>
-        </w:rPr>
-        <w:t xml:space="preserve">Grafana</w:t>
-      </w:r>
-      <w:r>
-        <w:t xml:space="preserve"> is provisioned as code with the data source and a 14-panel dashboard. Under generated load (valid, invalid and batch requests) both replicas served about 4 requests per second with 0 % server errors, a p95 latency near 50 ms, and a positive-prediction share matching the training prevalence.</w:t>
+        <w:t xml:space="preserve">Cluster, Deployment (2/2 ready), pods, PodDisruptionBudget and services, including the LoadBalancer.</w:t>
       </w:r>
     </w:p>
     <w:p>
@@ -4690,9 +4618,9 @@
       <w:r>
         <w:drawing>
           <wp:inline distT="0" distB="0" distL="0" distR="0">
-            <wp:extent cx="4295775" cy="4191000"/>
+            <wp:extent cx="5715000" cy="2009775"/>
             <wp:effectExtent t="0" r="0" b="0" l="0"/>
-            <wp:docPr id="16" name="grafana_02_dashboard_kiosk.png" descr="Grafana dashboard under load: service health, traffic and latency, and model behaviour." title="Grafana dashboard under load: service health, traffic and latency, and model behaviour."/>
+            <wp:docPr id="15" name="k8s_03_loadbalancer_requests.png" descr="Endpoint verification through the LoadBalancer, including a rejected invalid request and pod logs." title="Endpoint verification through the LoadBalancer, including a rejected invalid request and pod logs."/>
             <wp:cNvGraphicFramePr>
               <a:graphicFrameLocks xmlns:a="http://schemas.openxmlformats.org/drawingml/2006/main" noChangeAspect="1"/>
             </wp:cNvGraphicFramePr>
@@ -4715,7 +4643,7 @@
                   <pic:spPr bwMode="auto">
                     <a:xfrm>
                       <a:off x="0" y="0"/>
-                      <a:ext cx="4295775" cy="4191000"/>
+                      <a:ext cx="5715000" cy="2009775"/>
                     </a:xfrm>
                     <a:prstGeom prst="rect">
                       <a:avLst/>
@@ -4741,7 +4669,7 @@
           <w:sz w:val="18"/>
           <w:szCs w:val="18"/>
         </w:rPr>
-        <w:t xml:space="preserve">Figure 13. </w:t>
+        <w:t xml:space="preserve">Figure 12. </w:t>
       </w:r>
       <w:r>
         <w:rPr>
@@ -4751,7 +4679,60 @@
           <w:sz w:val="18"/>
           <w:szCs w:val="18"/>
         </w:rPr>
-        <w:t xml:space="preserve">Grafana dashboard under load: service health, traffic and latency, and model behaviour.</w:t>
+        <w:t xml:space="preserve">Endpoint verification through the LoadBalancer, including a rejected invalid request and pod logs.</w:t>
+      </w:r>
+    </w:p>
+    <w:p>
+      <w:pPr>
+        <w:pStyle w:val="Heading1"/>
+      </w:pPr>
+      <w:r>
+        <w:t xml:space="preserve">11. Monitoring and logging</w:t>
+      </w:r>
+    </w:p>
+    <w:p>
+      <w:pPr>
+        <w:spacing w:after="120" w:line="276"/>
+      </w:pPr>
+      <w:r>
+        <w:rPr>
+          <w:b/>
+          <w:bCs/>
+        </w:rPr>
+        <w:t xml:space="preserve">Logging:</w:t>
+      </w:r>
+      <w:r>
+        <w:t xml:space="preserve"> every request produces one JSON line (timestamp, request ID, method, path, status, latency, client) and every prediction one line with label, probability and risk band. Raw clinical inputs are never logged, because they are health data. </w:t>
+      </w:r>
+      <w:r>
+        <w:rPr>
+          <w:b/>
+          <w:bCs/>
+        </w:rPr>
+        <w:t xml:space="preserve">Metrics:</w:t>
+      </w:r>
+      <w:r>
+        <w:t xml:space="preserve"> request count and latency histograms per route template, in-flight requests, predictions per label and risk band, a histogram of predicted probabilities, inference time and model-loaded/model-info gauges. </w:t>
+      </w:r>
+      <w:r>
+        <w:rPr>
+          <w:b/>
+          <w:bCs/>
+        </w:rPr>
+        <w:t xml:space="preserve">Prometheus</w:t>
+      </w:r>
+      <w:r>
+        <w:t xml:space="preserve"> scrapes each replica every 10 seconds and evaluates five alert rules: replica down, model not loaded, 5xx ratio above 5 %, p95 /predict latency above 500 ms, and prediction drift (positive share far from the 46 % training prevalence). </w:t>
+      </w:r>
+      <w:r>
+        <w:rPr>
+          <w:b/>
+          <w:bCs/>
+        </w:rPr>
+        <w:t xml:space="preserve">Grafana</w:t>
+      </w:r>
+      <w:r>
+        <w:t xml:space="preserve"> is provisioned as code with the data source and a 14-panel dashboard. Under generated load (valid, invalid and batch requests) both replicas served about 4 requests per second with 0 % server errors, a p95 latency near 50 ms, and a positive-prediction share matching the training prevalence.</w:t>
       </w:r>
     </w:p>
     <w:p>
@@ -4763,9 +4744,9 @@
       <w:r>
         <w:drawing>
           <wp:inline distT="0" distB="0" distL="0" distR="0">
-            <wp:extent cx="3810000" cy="2381250"/>
+            <wp:extent cx="4295775" cy="4191000"/>
             <wp:effectExtent t="0" r="0" b="0" l="0"/>
-            <wp:docPr id="17" name="prometheus_01_targets.png" descr="Prometheus target health: both API replicas discovered through DNS and up." title="Prometheus target health: both API replicas discovered through DNS and up."/>
+            <wp:docPr id="16" name="grafana_02_dashboard_kiosk.png" descr="Grafana dashboard under load: service health, traffic and latency, and model behaviour." title="Grafana dashboard under load: service health, traffic and latency, and model behaviour."/>
             <wp:cNvGraphicFramePr>
               <a:graphicFrameLocks xmlns:a="http://schemas.openxmlformats.org/drawingml/2006/main" noChangeAspect="1"/>
             </wp:cNvGraphicFramePr>
@@ -4788,6 +4769,79 @@
                   <pic:spPr bwMode="auto">
                     <a:xfrm>
                       <a:off x="0" y="0"/>
+                      <a:ext cx="4295775" cy="4191000"/>
+                    </a:xfrm>
+                    <a:prstGeom prst="rect">
+                      <a:avLst/>
+                    </a:prstGeom>
+                  </pic:spPr>
+                </pic:pic>
+              </a:graphicData>
+            </a:graphic>
+          </wp:inline>
+        </w:drawing>
+      </w:r>
+    </w:p>
+    <w:p>
+      <w:pPr>
+        <w:spacing w:after="200"/>
+        <w:jc w:val="center"/>
+      </w:pPr>
+      <w:r>
+        <w:rPr>
+          <w:b/>
+          <w:bCs/>
+          <w:color w:val="555555"/>
+          <w:sz w:val="18"/>
+          <w:szCs w:val="18"/>
+        </w:rPr>
+        <w:t xml:space="preserve">Figure 13. </w:t>
+      </w:r>
+      <w:r>
+        <w:rPr>
+          <w:i/>
+          <w:iCs/>
+          <w:color w:val="555555"/>
+          <w:sz w:val="18"/>
+          <w:szCs w:val="18"/>
+        </w:rPr>
+        <w:t xml:space="preserve">Grafana dashboard under load: service health, traffic and latency, and model behaviour.</w:t>
+      </w:r>
+    </w:p>
+    <w:p>
+      <w:pPr>
+        <w:keepNext/>
+        <w:spacing w:after="40" w:before="120"/>
+        <w:jc w:val="center"/>
+      </w:pPr>
+      <w:r>
+        <w:drawing>
+          <wp:inline distT="0" distB="0" distL="0" distR="0">
+            <wp:extent cx="3810000" cy="2381250"/>
+            <wp:effectExtent t="0" r="0" b="0" l="0"/>
+            <wp:docPr id="17" name="prometheus_01_targets.png" descr="Prometheus target health: both API replicas discovered through DNS and up." title="Prometheus target health: both API replicas discovered through DNS and up."/>
+            <wp:cNvGraphicFramePr>
+              <a:graphicFrameLocks xmlns:a="http://schemas.openxmlformats.org/drawingml/2006/main" noChangeAspect="1"/>
+            </wp:cNvGraphicFramePr>
+            <a:graphic xmlns:a="http://schemas.openxmlformats.org/drawingml/2006/main">
+              <a:graphicData uri="http://schemas.openxmlformats.org/drawingml/2006/picture">
+                <pic:pic xmlns:pic="http://schemas.openxmlformats.org/drawingml/2006/picture">
+                  <pic:nvPicPr>
+                    <pic:cNvPr id="0" name="" descr=""/>
+                    <pic:cNvPicPr>
+                      <a:picLocks noChangeAspect="1" noChangeArrowheads="1"/>
+                    </pic:cNvPicPr>
+                  </pic:nvPicPr>
+                  <pic:blipFill>
+                    <a:blip r:embed="rId27" cstate="none"/>
+                    <a:srcRect/>
+                    <a:stretch>
+                      <a:fillRect/>
+                    </a:stretch>
+                  </pic:blipFill>
+                  <pic:spPr bwMode="auto">
+                    <a:xfrm>
+                      <a:off x="0" y="0"/>
                       <a:ext cx="3810000" cy="2381250"/>
                     </a:xfrm>
                     <a:prstGeom prst="rect">
@@ -4922,7 +4976,7 @@
         </w:rPr>
         <w:t xml:space="preserve">Repository: </w:t>
       </w:r>
-      <w:hyperlink w:history="1" r:id="rIdfoce5g_7n3ulrmpr07pek">
+      <w:hyperlink w:history="1" r:id="rIdxvbd_k_i7pkh32lwki_7t">
         <w:r>
           <w:rPr>
             <w:rStyle w:val="Hyperlink"/>
@@ -4942,7 +4996,7 @@
         </w:rPr>
         <w:t xml:space="preserve">CI/CD runs: </w:t>
       </w:r>
-      <w:hyperlink w:history="1" r:id="rIdjowj4uhzs0tycxjlnanb1">
+      <w:hyperlink w:history="1" r:id="rIdzywswjpbkstoj-dby1gd9">
         <w:r>
           <w:rPr>
             <w:rStyle w:val="Hyperlink"/>
@@ -4953,7 +5007,7 @@
     </w:p>
     <w:p>
       <w:pPr>
-        <w:spacing w:after="160"/>
+        <w:spacing w:after="80"/>
       </w:pPr>
       <w:r>
         <w:rPr>
@@ -4965,6 +5019,26 @@
       <w:r>
         <w:t xml:space="preserve">ghcr.io/akshaya-panda/mlops-assignment (tags: commit SHA, latest)</w:t>
       </w:r>
+    </w:p>
+    <w:p>
+      <w:pPr>
+        <w:spacing w:after="160"/>
+      </w:pPr>
+      <w:r>
+        <w:rPr>
+          <w:b/>
+          <w:bCs/>
+        </w:rPr>
+        <w:t xml:space="preserve">Pipeline video: </w:t>
+      </w:r>
+      <w:hyperlink w:history="1" r:id="rIdr4djgyo3aj9vpjvf5koc7">
+        <w:r>
+          <w:rPr>
+            <w:rStyle w:val="Hyperlink"/>
+          </w:rPr>
+          <w:t xml:space="preserve">https://drive.google.com/file/d/1v9RSQ5GZHEdgctoHnKYSgbIbN-CkWtpa/view?usp=sharing</w:t>
+        </w:r>
+      </w:hyperlink>
     </w:p>
     <w:tbl>
       <w:tblPr>

</xml_diff>